<commit_message>
feat(cv): update French and English CVs with modern high-res versions and sync latest bundle
</commit_message>
<xml_diff>
--- a/cv/CV_Angelo_EN.docx
+++ b/cv/CV_Angelo_EN.docx
@@ -2,710 +2,2797 @@
 <file path=word/document.xml><?xml version="1.0" encoding="utf-8"?>
 <w:document xmlns:wpc="http://schemas.microsoft.com/office/word/2010/wordprocessingCanvas" xmlns:mo="http://schemas.microsoft.com/office/mac/office/2008/main" xmlns:mc="http://schemas.openxmlformats.org/markup-compatibility/2006" xmlns:mv="urn:schemas-microsoft-com:mac:vml" xmlns:o="urn:schemas-microsoft-com:office:office" xmlns:r="http://schemas.openxmlformats.org/officeDocument/2006/relationships" xmlns:m="http://schemas.openxmlformats.org/officeDocument/2006/math" xmlns:v="urn:schemas-microsoft-com:vml" xmlns:wp14="http://schemas.microsoft.com/office/word/2010/wordprocessingDrawing" xmlns:wp="http://schemas.openxmlformats.org/drawingml/2006/wordprocessingDrawing" xmlns:w10="urn:schemas-microsoft-com:office:word" xmlns:w="http://schemas.openxmlformats.org/wordprocessingml/2006/main" xmlns:w14="http://schemas.microsoft.com/office/word/2010/wordml" xmlns:wpg="http://schemas.microsoft.com/office/word/2010/wordprocessingGroup" xmlns:wpi="http://schemas.microsoft.com/office/word/2010/wordprocessingInk" xmlns:wne="http://schemas.microsoft.com/office/word/2006/wordml" xmlns:wps="http://schemas.microsoft.com/office/word/2010/wordprocessingShape" mc:Ignorable="w14 wp14">
   <w:body>
-    <w:p>
-      <w:r>
-        <w:rPr>
-          <w:b/>
-          <w:color w:val="0D1117"/>
-          <w:sz w:val="44"/>
-        </w:rPr>
-        <w:t>Angelo Lock To Hang</w:t>
-      </w:r>
-    </w:p>
-    <w:p>
-      <w:r>
-        <w:rPr>
-          <w:b/>
-          <w:color w:val="00F5D4"/>
-          <w:sz w:val="20"/>
-        </w:rPr>
-        <w:t>Fullstack PHP/Laravel Developer &amp; AI Engineer</w:t>
-      </w:r>
-    </w:p>
-    <w:p>
-      <w:r>
-        <w:rPr>
-          <w:color w:val="6C757D"/>
-          <w:sz w:val="16"/>
-        </w:rPr>
-        <w:t>+261 34 13 539 78 | locktohang@gmail.com | Antananarivo, Madagascar | https://github.com/angelolockdev | https://linkedin.com/in/angelo-lock-to-hang | https://angelolockdev.github.io/</w:t>
-      </w:r>
-    </w:p>
-    <w:p>
-      <w:r>
-        <w:rPr>
-          <w:b/>
-          <w:color w:val="00BBF9"/>
-          <w:sz w:val="18"/>
-        </w:rPr>
-        <w:t>50+ projects delivered  -  6+ years of experience  -  PHP Laravel &amp; Symfony  -  AI RAG &amp; agents</w:t>
-      </w:r>
-    </w:p>
-    <w:p/>
-    <w:p>
-      <w:pPr>
-        <w:pBdr>
-          <w:bottom w:val="single" w:sz="6" w:space="1" w:color="00f5d4"/>
-        </w:pBdr>
-      </w:pPr>
-      <w:r>
-        <w:rPr>
-          <w:b/>
-          <w:color w:val="0D1117"/>
-          <w:sz w:val="24"/>
-        </w:rPr>
-        <w:t>PROFILE</w:t>
-      </w:r>
-    </w:p>
-    <w:p>
-      <w:r>
-        <w:rPr>
-          <w:sz w:val="18"/>
-        </w:rPr>
-        <w:t>Fullstack Developer with 6+ years of experience in PHP, Laravel and Symfony, combined with advanced applied AI integration. Delivered 50+ web, e-commerce, API and mobile projects, then designed RAG solutions, AI agents and products using multiple model providers. I combine clean architecture, security, testing and CI/CD automation to build maintainable, reliable systems.</w:t>
-      </w:r>
-    </w:p>
-    <w:p>
-      <w:pPr>
-        <w:pBdr>
-          <w:bottom w:val="single" w:sz="6" w:space="1" w:color="00f5d4"/>
-        </w:pBdr>
-      </w:pPr>
-      <w:r>
-        <w:rPr>
-          <w:b/>
-          <w:color w:val="0D1117"/>
-          <w:sz w:val="24"/>
-        </w:rPr>
-        <w:t>WORK EXPERIENCE</w:t>
-      </w:r>
-    </w:p>
-    <w:p>
-      <w:r>
-        <w:rPr>
-          <w:b/>
-          <w:color w:val="0D1117"/>
-          <w:sz w:val="20"/>
-        </w:rPr>
-        <w:t>AI Engineer &amp; Product Developer - Independent projects</w:t>
-      </w:r>
-      <w:r>
-        <w:rPr>
-          <w:color w:val="00BBF9"/>
-          <w:sz w:val="17"/>
-        </w:rPr>
-        <w:t xml:space="preserve">  (2024 - Present)</w:t>
-      </w:r>
-    </w:p>
-    <w:p>
-      <w:pPr>
-        <w:pStyle w:val="ListBullet"/>
-      </w:pPr>
-      <w:r>
-        <w:rPr>
-          <w:color w:val="1A1A2E"/>
-          <w:sz w:val="17"/>
-        </w:rPr>
-        <w:t>Designed Akademia, a Laravel/PostgreSQL and Flutter platform integrating RAG, vector search and structured, source-cited responses</w:t>
-      </w:r>
-    </w:p>
-    <w:p>
-      <w:pPr>
-        <w:pStyle w:val="ListBullet"/>
-      </w:pPr>
-      <w:r>
-        <w:rPr>
-          <w:color w:val="1A1A2E"/>
-          <w:sz w:val="17"/>
-        </w:rPr>
-        <w:t>Integrated OpenAI, Gemini, xAI and Hugging Face server-side through secure adapters without exposing credentials or orchestration to clients</w:t>
-      </w:r>
-    </w:p>
-    <w:p>
-      <w:pPr>
-        <w:pStyle w:val="ListBullet"/>
-      </w:pPr>
-      <w:r>
-        <w:rPr>
-          <w:color w:val="1A1A2E"/>
-          <w:sz w:val="17"/>
-        </w:rPr>
-        <w:t>Built CaptionForge, Universal Agent Rules and API, MCP and webhook-based multi-agent workflows with contextual memory, traceability and human validation</w:t>
-      </w:r>
-    </w:p>
-    <w:p>
-      <w:r>
-        <w:rPr>
-          <w:i/>
-          <w:color w:val="6C757D"/>
-          <w:sz w:val="15"/>
-        </w:rPr>
-        <w:t>Tech: Laravel, PHP, Python, RAG, LLM, AI Agents, OpenAI, Gemini, xAI, Hugging Face, MCP, PostgreSQL, Flutter, TypeScript</w:t>
-      </w:r>
-    </w:p>
-    <w:p>
-      <w:r>
-        <w:rPr>
-          <w:b/>
-          <w:color w:val="0D1117"/>
-          <w:sz w:val="20"/>
-        </w:rPr>
-        <w:t>Backend PHP Developer / Fullstack - Fulldigits SARL</w:t>
-      </w:r>
-      <w:r>
-        <w:rPr>
-          <w:color w:val="00BBF9"/>
-          <w:sz w:val="17"/>
-        </w:rPr>
-        <w:t xml:space="preserve">  (01/2020 - Present)</w:t>
-      </w:r>
-    </w:p>
-    <w:p>
-      <w:pPr>
-        <w:pStyle w:val="ListBullet"/>
-      </w:pPr>
-      <w:r>
-        <w:rPr>
-          <w:color w:val="1A1A2E"/>
-          <w:sz w:val="17"/>
-        </w:rPr>
-        <w:t>Built and evolved 50+ web applications, e-commerce systems, APIs and digital services (PHP, Laravel, Symfony, WordPress, MySQL, PL/SQL)</w:t>
-      </w:r>
-    </w:p>
-    <w:p>
-      <w:pPr>
-        <w:pStyle w:val="ListBullet"/>
-      </w:pPr>
-      <w:r>
-        <w:rPr>
-          <w:color w:val="1A1A2E"/>
-          <w:sz w:val="17"/>
-        </w:rPr>
-        <w:t>Industrialised environments with Docker, MySQL, Apache and Bitbucket Pipelines to improve deployment speed and reliability</w:t>
-      </w:r>
-    </w:p>
-    <w:p>
-      <w:pPr>
-        <w:pStyle w:val="ListBullet"/>
-      </w:pPr>
-      <w:r>
-        <w:rPr>
-          <w:color w:val="1A1A2E"/>
-          <w:sz w:val="17"/>
-        </w:rPr>
-        <w:t>Corrective and evolutive maintenance, functional testing, production releases and QA</w:t>
-      </w:r>
-    </w:p>
-    <w:p>
-      <w:pPr>
-        <w:pStyle w:val="ListBullet"/>
-      </w:pPr>
-      <w:r>
-        <w:rPr>
-          <w:color w:val="1A1A2E"/>
-          <w:sz w:val="17"/>
-        </w:rPr>
-        <w:t>Integrated RESTful API services and automated delivery pipelines</w:t>
-      </w:r>
-    </w:p>
-    <w:p>
-      <w:r>
-        <w:rPr>
-          <w:i/>
-          <w:color w:val="6C757D"/>
-          <w:sz w:val="15"/>
-        </w:rPr>
-        <w:t>Tech: PHP, Laravel, Symfony, WordPress, MySQL, PL/SQL, Docker, Apache, Git, Bitbucket Pipelines, REST API</w:t>
-      </w:r>
-    </w:p>
-    <w:p>
-      <w:r>
-        <w:rPr>
-          <w:b/>
-          <w:color w:val="0D1117"/>
-          <w:sz w:val="20"/>
-        </w:rPr>
-        <w:t>Backend Node.js Developer - Sinopsis</w:t>
-      </w:r>
-      <w:r>
-        <w:rPr>
-          <w:color w:val="00BBF9"/>
-          <w:sz w:val="17"/>
-        </w:rPr>
-        <w:t xml:space="preserve">  (10/2019 - 01/2020)</w:t>
-      </w:r>
-    </w:p>
-    <w:p>
-      <w:pPr>
-        <w:pStyle w:val="ListBullet"/>
-      </w:pPr>
-      <w:r>
-        <w:rPr>
-          <w:color w:val="1A1A2E"/>
-          <w:sz w:val="17"/>
-        </w:rPr>
-        <w:t>Designed PostgreSQL data model and implemented business rules</w:t>
-      </w:r>
-    </w:p>
-    <w:p>
-      <w:pPr>
-        <w:pStyle w:val="ListBullet"/>
-      </w:pPr>
-      <w:r>
-        <w:rPr>
-          <w:color w:val="1A1A2E"/>
-          <w:sz w:val="17"/>
-        </w:rPr>
-        <w:t>Built web services with Node.js, Express and Java Spring Boot</w:t>
-      </w:r>
-    </w:p>
-    <w:p>
-      <w:pPr>
-        <w:pStyle w:val="ListBullet"/>
-      </w:pPr>
-      <w:r>
-        <w:rPr>
-          <w:color w:val="1A1A2E"/>
-          <w:sz w:val="17"/>
-        </w:rPr>
-        <w:t>Structured backend services around PostgreSQL</w:t>
-      </w:r>
-    </w:p>
-    <w:p>
-      <w:r>
-        <w:rPr>
-          <w:i/>
-          <w:color w:val="6C757D"/>
-          <w:sz w:val="15"/>
-        </w:rPr>
-        <w:t>Tech: Node.js, Express.js, Java, Spring Boot, PostgreSQL, REST API, Git</w:t>
-      </w:r>
-    </w:p>
-    <w:p>
-      <w:r>
-        <w:rPr>
-          <w:b/>
-          <w:color w:val="0D1117"/>
-          <w:sz w:val="20"/>
-        </w:rPr>
-        <w:t>PHP Web Developer Intern - Fulldigits SARL</w:t>
-      </w:r>
-      <w:r>
-        <w:rPr>
-          <w:color w:val="00BBF9"/>
-          <w:sz w:val="17"/>
-        </w:rPr>
-        <w:t xml:space="preserve">  (09/2019 - 01/2020)</w:t>
-      </w:r>
-    </w:p>
-    <w:p>
-      <w:pPr>
-        <w:pStyle w:val="ListBullet"/>
-      </w:pPr>
-      <w:r>
-        <w:rPr>
-          <w:color w:val="1A1A2E"/>
-          <w:sz w:val="17"/>
-        </w:rPr>
-        <w:t>Participated in e-commerce site development (PHP, MySQL)</w:t>
-      </w:r>
-    </w:p>
-    <w:p>
-      <w:pPr>
-        <w:pStyle w:val="ListBullet"/>
-      </w:pPr>
-      <w:r>
-        <w:rPr>
-          <w:color w:val="1A1A2E"/>
-          <w:sz w:val="17"/>
-        </w:rPr>
-        <w:t>Updated and fixed bugs on the application back-office</w:t>
-      </w:r>
-    </w:p>
-    <w:p>
-      <w:r>
-        <w:rPr>
-          <w:i/>
-          <w:color w:val="6C757D"/>
-          <w:sz w:val="15"/>
-        </w:rPr>
-        <w:t>Tech: PHP, MySQL, HTML, CSS, Git</w:t>
-      </w:r>
-    </w:p>
-    <w:p>
-      <w:r>
-        <w:rPr>
-          <w:b/>
-          <w:color w:val="0D1117"/>
-          <w:sz w:val="20"/>
-        </w:rPr>
-        <w:t>Java Web Developer Intern - Ministry TEFPLS</w:t>
-      </w:r>
-      <w:r>
-        <w:rPr>
-          <w:color w:val="00BBF9"/>
-          <w:sz w:val="17"/>
-        </w:rPr>
-        <w:t xml:space="preserve">  (08/2018 - 11/2018)</w:t>
-      </w:r>
-    </w:p>
-    <w:p>
-      <w:pPr>
-        <w:pStyle w:val="ListBullet"/>
-      </w:pPr>
-      <w:r>
-        <w:rPr>
-          <w:color w:val="1A1A2E"/>
-          <w:sz w:val="17"/>
-        </w:rPr>
-        <w:t>Analysed existing system and built REST API services with Spring</w:t>
-      </w:r>
-    </w:p>
-    <w:p>
-      <w:pPr>
-        <w:pStyle w:val="ListBullet"/>
-      </w:pPr>
-      <w:r>
-        <w:rPr>
-          <w:color w:val="1A1A2E"/>
-          <w:sz w:val="17"/>
-        </w:rPr>
-        <w:t>Set up application hosting and delivery process (SSH, FTP)</w:t>
-      </w:r>
-    </w:p>
-    <w:p>
-      <w:r>
-        <w:rPr>
-          <w:i/>
-          <w:color w:val="6C757D"/>
-          <w:sz w:val="15"/>
-        </w:rPr>
-        <w:t>Tech: Java, Spring, REST API, SSH, FTP, Git</w:t>
-      </w:r>
-    </w:p>
-    <w:p>
-      <w:pPr>
-        <w:pBdr>
-          <w:bottom w:val="single" w:sz="6" w:space="1" w:color="00f5d4"/>
-        </w:pBdr>
-      </w:pPr>
-      <w:r>
-        <w:rPr>
-          <w:b/>
-          <w:color w:val="0D1117"/>
-          <w:sz w:val="24"/>
-        </w:rPr>
-        <w:t>KEY PROJECTS</w:t>
-      </w:r>
-    </w:p>
-    <w:p>
-      <w:r>
-        <w:rPr>
-          <w:b/>
-          <w:color w:val="0D1117"/>
-          <w:sz w:val="19"/>
-        </w:rPr>
-        <w:t>Akademia</w:t>
-      </w:r>
-      <w:r>
-        <w:rPr>
-          <w:color w:val="9B5DE5"/>
-          <w:sz w:val="16"/>
-        </w:rPr>
-        <w:t xml:space="preserve">  [Education platform + RAG]  2024-2026</w:t>
-      </w:r>
-    </w:p>
-    <w:p>
-      <w:r>
-        <w:rPr>
-          <w:sz w:val="17"/>
-        </w:rPr>
-        <w:t>Educational SaaS Laravel 13/PostgreSQL with Flutter app, serving schools and individual learners. RAG integration for pedagogical assistance.</w:t>
-      </w:r>
-    </w:p>
-    <w:p>
-      <w:r>
-        <w:rPr>
-          <w:i/>
-          <w:color w:val="00BBF9"/>
-          <w:sz w:val="16"/>
-        </w:rPr>
-        <w:t>Impact: Multi-tenant architecture with RAG for BEPC, BACC and competitive exam preparation</w:t>
-      </w:r>
-    </w:p>
-    <w:p>
-      <w:r>
-        <w:rPr>
-          <w:b/>
-          <w:color w:val="0D1117"/>
-          <w:sz w:val="19"/>
-        </w:rPr>
-        <w:t>Madagascar University Fair (FUM)</w:t>
-      </w:r>
-      <w:r>
-        <w:rPr>
-          <w:color w:val="9B5DE5"/>
-          <w:sz w:val="16"/>
-        </w:rPr>
-        <w:t xml:space="preserve">  [Freelance project]  2025</w:t>
-      </w:r>
-    </w:p>
-    <w:p>
-      <w:r>
-        <w:rPr>
-          <w:sz w:val="17"/>
-        </w:rPr>
-        <w:t>Dynamic website for the FUM organised by Prime Vision: institute search, dynamic pages, exhibitor registration with PDF by email.</w:t>
-      </w:r>
-    </w:p>
-    <w:p>
-      <w:r>
-        <w:rPr>
-          <w:i/>
-          <w:color w:val="00BBF9"/>
-          <w:sz w:val="16"/>
-        </w:rPr>
-        <w:t>Impact: Event platform with filterable gallery and registration forms</w:t>
-      </w:r>
-    </w:p>
-    <w:p>
-      <w:pPr>
-        <w:pBdr>
-          <w:bottom w:val="single" w:sz="6" w:space="1" w:color="00f5d4"/>
-        </w:pBdr>
-      </w:pPr>
-      <w:r>
-        <w:rPr>
-          <w:b/>
-          <w:color w:val="0D1117"/>
-          <w:sz w:val="24"/>
-        </w:rPr>
-        <w:t>EDUCATION</w:t>
-      </w:r>
-    </w:p>
-    <w:p>
-      <w:r>
-        <w:rPr>
-          <w:b/>
-          <w:sz w:val="19"/>
-        </w:rPr>
-        <w:t>Bachelor's Degree in Software Development</w:t>
-      </w:r>
-    </w:p>
-    <w:p>
-      <w:r>
-        <w:rPr>
-          <w:color w:val="6C757D"/>
-          <w:sz w:val="17"/>
-        </w:rPr>
-        <w:t>IT University - 09/2015 - 12/2018</w:t>
-      </w:r>
-    </w:p>
-    <w:p>
-      <w:pPr>
-        <w:pBdr>
-          <w:bottom w:val="single" w:sz="6" w:space="1" w:color="00f5d4"/>
-        </w:pBdr>
-      </w:pPr>
-      <w:r>
-        <w:rPr>
-          <w:b/>
-          <w:color w:val="0D1117"/>
-          <w:sz w:val="24"/>
-        </w:rPr>
-        <w:t>CERTIFICATIONS</w:t>
-      </w:r>
-    </w:p>
-    <w:p>
-      <w:pPr>
-        <w:pStyle w:val="ListBullet"/>
-      </w:pPr>
-      <w:r>
-        <w:rPr>
-          <w:sz w:val="17"/>
-        </w:rPr>
-        <w:t>DELF B2 - French Language Diploma - Alliance Française Antananarivo</w:t>
-      </w:r>
-    </w:p>
-    <w:p>
-      <w:pPr>
-        <w:pBdr>
-          <w:bottom w:val="single" w:sz="6" w:space="1" w:color="00f5d4"/>
-        </w:pBdr>
-      </w:pPr>
-      <w:r>
-        <w:rPr>
-          <w:b/>
-          <w:color w:val="0D1117"/>
-          <w:sz w:val="24"/>
-        </w:rPr>
-        <w:t>SKILLS</w:t>
-      </w:r>
-    </w:p>
-    <w:p>
-      <w:r>
-        <w:rPr>
-          <w:b/>
-          <w:sz w:val="18"/>
-        </w:rPr>
-        <w:t xml:space="preserve">Back-end: </w:t>
-      </w:r>
-      <w:r>
-        <w:rPr>
-          <w:sz w:val="18"/>
-        </w:rPr>
-        <w:t>PHP, Laravel, Symfony, Python, Node.js, Java, Spring Boot, WordPress</w:t>
-      </w:r>
-    </w:p>
-    <w:p>
-      <w:r>
-        <w:rPr>
-          <w:b/>
-          <w:sz w:val="18"/>
-        </w:rPr>
-        <w:t xml:space="preserve">Front-end: </w:t>
-      </w:r>
-      <w:r>
-        <w:rPr>
-          <w:sz w:val="18"/>
-        </w:rPr>
-        <w:t>React, TypeScript, JavaScript, Flutter, HTML5, CSS3, Tailwind CSS</w:t>
-      </w:r>
-    </w:p>
-    <w:p>
-      <w:r>
-        <w:rPr>
-          <w:b/>
-          <w:sz w:val="18"/>
-        </w:rPr>
-        <w:t xml:space="preserve">Database: </w:t>
-      </w:r>
-      <w:r>
-        <w:rPr>
-          <w:sz w:val="18"/>
-        </w:rPr>
-        <w:t>MySQL, PostgreSQL, MongoDB, PL/SQL, Supabase</w:t>
-      </w:r>
-    </w:p>
-    <w:p>
-      <w:r>
-        <w:rPr>
-          <w:b/>
-          <w:sz w:val="18"/>
-        </w:rPr>
-        <w:t xml:space="preserve">DevOps &amp; Ops: </w:t>
-      </w:r>
-      <w:r>
-        <w:rPr>
-          <w:sz w:val="18"/>
-        </w:rPr>
-        <w:t>Docker, Linux, Apache, GitHub Actions, Bitbucket Pipelines, CI/CD, VPS</w:t>
-      </w:r>
-    </w:p>
-    <w:p>
-      <w:r>
-        <w:rPr>
-          <w:b/>
-          <w:sz w:val="18"/>
-        </w:rPr>
-        <w:t xml:space="preserve">AI &amp; Data: </w:t>
-      </w:r>
-      <w:r>
-        <w:rPr>
-          <w:sz w:val="18"/>
-        </w:rPr>
-        <w:t>RAG, Vector Search, LLM, AI Agents, OpenAI, Gemini, xAI, Hugging Face, Prompt Engineering, Structured Outputs</w:t>
-      </w:r>
-    </w:p>
-    <w:p>
-      <w:r>
-        <w:rPr>
-          <w:b/>
-          <w:sz w:val="18"/>
-        </w:rPr>
-        <w:t xml:space="preserve">Other: </w:t>
-      </w:r>
-      <w:r>
-        <w:rPr>
-          <w:sz w:val="18"/>
-        </w:rPr>
-        <w:t>Rust, REST API, GraphQL, Git, Scrum, Clean Architecture, TDD</w:t>
-      </w:r>
-    </w:p>
-    <w:p>
-      <w:pPr>
-        <w:pBdr>
-          <w:bottom w:val="single" w:sz="6" w:space="1" w:color="00f5d4"/>
-        </w:pBdr>
-      </w:pPr>
-      <w:r>
-        <w:rPr>
-          <w:b/>
-          <w:color w:val="0D1117"/>
-          <w:sz w:val="24"/>
-        </w:rPr>
-        <w:t>LANGUAGES</w:t>
-      </w:r>
-    </w:p>
-    <w:p>
-      <w:pPr>
-        <w:pStyle w:val="ListBullet"/>
-      </w:pPr>
-      <w:r>
-        <w:rPr>
-          <w:sz w:val="18"/>
-        </w:rPr>
-        <w:t>French - C1 - Proficient</w:t>
-      </w:r>
-    </w:p>
-    <w:p>
-      <w:pPr>
-        <w:pStyle w:val="ListBullet"/>
-      </w:pPr>
-      <w:r>
-        <w:rPr>
-          <w:sz w:val="18"/>
-        </w:rPr>
-        <w:t>English - B1 - Intermediate</w:t>
-      </w:r>
-    </w:p>
-    <w:p>
-      <w:pPr>
-        <w:pStyle w:val="ListBullet"/>
-      </w:pPr>
-      <w:r>
-        <w:rPr>
-          <w:sz w:val="18"/>
-        </w:rPr>
-        <w:t>Malagasy - Native</w:t>
-      </w:r>
-    </w:p>
-    <w:p>
-      <w:pPr>
-        <w:pBdr>
-          <w:bottom w:val="single" w:sz="6" w:space="1" w:color="00f5d4"/>
-        </w:pBdr>
-      </w:pPr>
-      <w:r>
-        <w:rPr>
-          <w:b/>
-          <w:color w:val="0D1117"/>
-          <w:sz w:val="24"/>
-        </w:rPr>
-        <w:t>INTERESTS</w:t>
-      </w:r>
-    </w:p>
-    <w:p>
-      <w:r>
-        <w:rPr>
-          <w:sz w:val="18"/>
-        </w:rPr>
-        <w:t>Generative AI, Algo trading XAU/USD, High-Tech, Football, Video games</w:t>
-      </w:r>
-    </w:p>
+    <w:tbl>
+      <w:tblPr>
+        <w:tblW w:type="dxa" w:w="11906"/>
+        <w:jc w:val="left"/>
+        <w:tblLayout w:type="fixed"/>
+        <w:tblLook w:firstColumn="1" w:firstRow="1" w:lastColumn="0" w:lastRow="0" w:noHBand="0" w:noVBand="1" w:val="04A0"/>
+        <w:tblBorders>
+          <w:top w:val="nil"/>
+          <w:left w:val="nil"/>
+          <w:bottom w:val="nil"/>
+          <w:right w:val="nil"/>
+          <w:insideH w:val="nil"/>
+          <w:insideV w:val="nil"/>
+        </w:tblBorders>
+      </w:tblPr>
+      <w:tblGrid>
+        <w:gridCol w:w="3798"/>
+        <w:gridCol w:w="8107"/>
+      </w:tblGrid>
+      <w:tr>
+        <w:trPr>
+          <w:trHeight w:val="3742" w:hRule="exact"/>
+          <w:cantSplit/>
+        </w:trPr>
+        <w:tc>
+          <w:tcPr>
+            <w:tcW w:type="dxa" w:w="3798"/>
+            <w:vMerge w:val="restart"/>
+            <w:vAlign w:val="top"/>
+            <w:shd w:val="clear" w:color="auto" w:fill="D9E6EC"/>
+            <w:tcMar>
+              <w:top w:w="765" w:type="dxa"/>
+              <w:left w:w="0" w:type="dxa"/>
+              <w:bottom w:w="510" w:type="dxa"/>
+              <w:right w:w="0" w:type="dxa"/>
+            </w:tcMar>
+          </w:tcPr>
+          <w:p>
+            <w:pPr>
+              <w:keepLines w:val="0"/>
+              <w:spacing w:before="0" w:after="220" w:line="240" w:lineRule="auto"/>
+              <w:ind w:left="680" w:right="482"/>
+              <w:jc w:val="center"/>
+            </w:pPr>
+            <w:r>
+              <w:drawing>
+                <wp:inline xmlns:a="http://schemas.openxmlformats.org/drawingml/2006/main" xmlns:pic="http://schemas.openxmlformats.org/drawingml/2006/picture">
+                  <wp:extent cx="1728000" cy="1728000"/>
+                  <wp:docPr id="1" name="Picture 1"/>
+                  <wp:cNvGraphicFramePr>
+                    <a:graphicFrameLocks noChangeAspect="1"/>
+                  </wp:cNvGraphicFramePr>
+                  <a:graphic>
+                    <a:graphicData uri="http://schemas.openxmlformats.org/drawingml/2006/picture">
+                      <pic:pic>
+                        <pic:nvPicPr>
+                          <pic:cNvPr id="0" name="angelo-profile-circle.png"/>
+                          <pic:cNvPicPr/>
+                        </pic:nvPicPr>
+                        <pic:blipFill>
+                          <a:blip r:embed="rId9"/>
+                          <a:stretch>
+                            <a:fillRect/>
+                          </a:stretch>
+                        </pic:blipFill>
+                        <pic:spPr>
+                          <a:xfrm>
+                            <a:off x="0" y="0"/>
+                            <a:ext cx="1728000" cy="1728000"/>
+                          </a:xfrm>
+                          <a:prstGeom prst="rect"/>
+                        </pic:spPr>
+                      </pic:pic>
+                    </a:graphicData>
+                  </a:graphic>
+                </wp:inline>
+              </w:drawing>
+            </w:r>
+          </w:p>
+          <w:tbl>
+            <w:tblPr>
+              <w:tblW w:type="dxa" w:w="2636"/>
+              <w:jc w:val="left"/>
+              <w:tblLayout w:type="fixed"/>
+              <w:tblLook w:firstColumn="1" w:firstRow="1" w:lastColumn="0" w:lastRow="0" w:noHBand="0" w:noVBand="1" w:val="04A0"/>
+              <w:tblInd w:w="680" w:type="dxa"/>
+              <w:tblBorders>
+                <w:top w:val="nil"/>
+                <w:left w:val="nil"/>
+                <w:bottom w:val="nil"/>
+                <w:right w:val="nil"/>
+                <w:insideH w:val="nil"/>
+                <w:insideV w:val="nil"/>
+              </w:tblBorders>
+            </w:tblPr>
+            <w:tblGrid>
+              <w:gridCol w:w="595"/>
+              <w:gridCol w:w="2041"/>
+            </w:tblGrid>
+            <w:tr>
+              <w:tc>
+                <w:tcPr>
+                  <w:tcW w:type="dxa" w:w="595"/>
+                  <w:tcMar>
+                    <w:top w:w="0" w:type="dxa"/>
+                    <w:left w:w="0" w:type="dxa"/>
+                    <w:bottom w:w="0" w:type="dxa"/>
+                    <w:right w:w="0" w:type="dxa"/>
+                  </w:tcMar>
+                  <w:vAlign w:val="center"/>
+                </w:tcPr>
+                <w:p>
+                  <w:pPr>
+                    <w:keepLines w:val="0"/>
+                    <w:spacing w:before="0" w:after="0" w:line="240" w:lineRule="auto"/>
+                  </w:pPr>
+                  <w:r>
+                    <w:drawing>
+                      <wp:inline xmlns:a="http://schemas.openxmlformats.org/drawingml/2006/main" xmlns:pic="http://schemas.openxmlformats.org/drawingml/2006/picture">
+                        <wp:extent cx="378000" cy="378000"/>
+                        <wp:docPr id="2" name="Picture 2"/>
+                        <wp:cNvGraphicFramePr>
+                          <a:graphicFrameLocks noChangeAspect="1"/>
+                        </wp:cNvGraphicFramePr>
+                        <a:graphic>
+                          <a:graphicData uri="http://schemas.openxmlformats.org/drawingml/2006/picture">
+                            <pic:pic>
+                              <pic:nvPicPr>
+                                <pic:cNvPr id="0" name="portfolio-qr.png"/>
+                                <pic:cNvPicPr/>
+                              </pic:nvPicPr>
+                              <pic:blipFill>
+                                <a:blip r:embed="rId10"/>
+                                <a:stretch>
+                                  <a:fillRect/>
+                                </a:stretch>
+                              </pic:blipFill>
+                              <pic:spPr>
+                                <a:xfrm>
+                                  <a:off x="0" y="0"/>
+                                  <a:ext cx="378000" cy="378000"/>
+                                </a:xfrm>
+                                <a:prstGeom prst="rect"/>
+                              </pic:spPr>
+                            </pic:pic>
+                          </a:graphicData>
+                        </a:graphic>
+                      </wp:inline>
+                    </w:drawing>
+                  </w:r>
+                </w:p>
+              </w:tc>
+              <w:tc>
+                <w:tcPr>
+                  <w:tcW w:type="dxa" w:w="2041"/>
+                  <w:tcMar>
+                    <w:top w:w="0" w:type="dxa"/>
+                    <w:left w:w="0" w:type="dxa"/>
+                    <w:bottom w:w="0" w:type="dxa"/>
+                    <w:right w:w="0" w:type="dxa"/>
+                  </w:tcMar>
+                  <w:vAlign w:val="center"/>
+                </w:tcPr>
+                <w:p>
+                  <w:pPr>
+                    <w:keepLines w:val="0"/>
+                    <w:spacing w:before="0" w:after="24" w:line="240" w:lineRule="auto"/>
+                  </w:pPr>
+                  <w:r>
+                    <w:rPr>
+                      <w:rFonts w:ascii="Source Sans 3" w:hAnsi="Source Sans 3" w:eastAsia="Source Sans 3" w:cs="Source Sans 3"/>
+                      <w:b/>
+                      <w:i w:val="0"/>
+                      <w:color w:val="173F4B"/>
+                      <w:sz w:val="14"/>
+                      <w:spacing w:val="12"/>
+                    </w:rPr>
+                    <w:t>PORTFOLIO</w:t>
+                  </w:r>
+                </w:p>
+                <w:p>
+                  <w:pPr>
+                    <w:keepLines w:val="0"/>
+                    <w:spacing w:before="0" w:after="0" w:line="240" w:lineRule="auto"/>
+                  </w:pPr>
+                  <w:hyperlink r:id="rId11">
+                    <w:r>
+                      <w:rPr>
+                        <w:rFonts w:ascii="Source Sans 3" w:hAnsi="Source Sans 3" w:eastAsia="Source Sans 3" w:cs="Source Sans 3"/>
+                        <w:color w:val="1F414D"/>
+                        <w:sz w:val="13"/>
+                        <w:szCs w:val="13"/>
+                      </w:rPr>
+                      <w:t>angelolockdev.github.io</w:t>
+                    </w:r>
+                  </w:hyperlink>
+                </w:p>
+              </w:tc>
+            </w:tr>
+          </w:tbl>
+          <w:p>
+            <w:pPr>
+              <w:spacing w:before="0" w:after="0" w:line="240" w:lineRule="auto"/>
+              <w:ind w:left="680" w:right="482"/>
+            </w:pPr>
+            <w:r>
+              <w:rPr>
+                <w:rFonts w:ascii="Source Sans 3" w:hAnsi="Source Sans 3" w:eastAsia="Source Sans 3" w:cs="Source Sans 3"/>
+                <w:b w:val="0"/>
+                <w:i w:val="0"/>
+                <w:color w:val="465E67"/>
+                <w:sz w:val="2"/>
+              </w:rPr>
+              <w:t xml:space="preserve"> </w:t>
+            </w:r>
+          </w:p>
+          <w:p>
+            <w:pPr>
+              <w:keepLines w:val="0"/>
+              <w:spacing w:before="4" w:after="80" w:line="240" w:lineRule="auto"/>
+              <w:ind w:right="482" w:left="680"/>
+              <w:pBdr>
+                <w:bottom w:val="single" w:sz="5" w:space="0" w:color="8FA8B2"/>
+              </w:pBdr>
+            </w:pPr>
+            <w:r>
+              <w:rPr>
+                <w:rFonts w:ascii="Source Sans 3" w:hAnsi="Source Sans 3" w:eastAsia="Source Sans 3" w:cs="Source Sans 3"/>
+                <w:b w:val="0"/>
+                <w:i w:val="0"/>
+                <w:color w:val="173F4B"/>
+                <w:sz w:val="2"/>
+              </w:rPr>
+              <w:t xml:space="preserve"> </w:t>
+            </w:r>
+          </w:p>
+          <w:p>
+            <w:pPr>
+              <w:keepNext/>
+              <w:keepLines/>
+              <w:spacing w:before="0" w:after="0" w:line="240" w:lineRule="auto"/>
+              <w:ind w:left="680" w:right="482"/>
+            </w:pPr>
+            <w:r>
+              <w:drawing>
+                <wp:inline xmlns:a="http://schemas.openxmlformats.org/drawingml/2006/main" xmlns:pic="http://schemas.openxmlformats.org/drawingml/2006/picture">
+                  <wp:extent cx="104400" cy="104400"/>
+                  <wp:docPr id="3" name="Picture 3"/>
+                  <wp:cNvGraphicFramePr>
+                    <a:graphicFrameLocks noChangeAspect="1"/>
+                  </wp:cNvGraphicFramePr>
+                  <a:graphic>
+                    <a:graphicData uri="http://schemas.openxmlformats.org/drawingml/2006/picture">
+                      <pic:pic>
+                        <pic:nvPicPr>
+                          <pic:cNvPr id="0" name="contact.png"/>
+                          <pic:cNvPicPr/>
+                        </pic:nvPicPr>
+                        <pic:blipFill>
+                          <a:blip r:embed="rId12"/>
+                          <a:stretch>
+                            <a:fillRect/>
+                          </a:stretch>
+                        </pic:blipFill>
+                        <pic:spPr>
+                          <a:xfrm>
+                            <a:off x="0" y="0"/>
+                            <a:ext cx="104400" cy="104400"/>
+                          </a:xfrm>
+                          <a:prstGeom prst="rect"/>
+                        </pic:spPr>
+                      </pic:pic>
+                    </a:graphicData>
+                  </a:graphic>
+                </wp:inline>
+              </w:drawing>
+            </w:r>
+            <w:r>
+              <w:rPr>
+                <w:rFonts w:ascii="Source Sans 3" w:hAnsi="Source Sans 3" w:eastAsia="Source Sans 3" w:cs="Source Sans 3"/>
+                <w:b w:val="0"/>
+                <w:i w:val="0"/>
+                <w:color w:val="173F4B"/>
+                <w:sz w:val="4"/>
+              </w:rPr>
+              <w:t xml:space="preserve">  </w:t>
+            </w:r>
+            <w:r>
+              <w:rPr>
+                <w:rFonts w:ascii="Source Sans 3" w:hAnsi="Source Sans 3" w:eastAsia="Source Sans 3" w:cs="Source Sans 3"/>
+                <w:b/>
+                <w:i w:val="0"/>
+                <w:color w:val="173F4B"/>
+                <w:sz w:val="17"/>
+                <w:spacing w:val="18"/>
+              </w:rPr>
+              <w:t>CONTACT</w:t>
+            </w:r>
+          </w:p>
+          <w:p>
+            <w:pPr>
+              <w:keepLines w:val="0"/>
+              <w:spacing w:before="8" w:after="60" w:line="240" w:lineRule="auto"/>
+              <w:ind w:right="482" w:left="680"/>
+              <w:pBdr>
+                <w:bottom w:val="single" w:sz="5" w:space="0" w:color="8FA8B2"/>
+              </w:pBdr>
+            </w:pPr>
+            <w:r>
+              <w:rPr>
+                <w:rFonts w:ascii="Source Sans 3" w:hAnsi="Source Sans 3" w:eastAsia="Source Sans 3" w:cs="Source Sans 3"/>
+                <w:b w:val="0"/>
+                <w:i w:val="0"/>
+                <w:color w:val="173F4B"/>
+                <w:sz w:val="2"/>
+              </w:rPr>
+              <w:t xml:space="preserve"> </w:t>
+            </w:r>
+          </w:p>
+          <w:tbl>
+            <w:tblPr>
+              <w:tblW w:type="dxa" w:w="2636"/>
+              <w:jc w:val="left"/>
+              <w:tblLayout w:type="fixed"/>
+              <w:tblLook w:firstColumn="1" w:firstRow="1" w:lastColumn="0" w:lastRow="0" w:noHBand="0" w:noVBand="1" w:val="04A0"/>
+              <w:tblInd w:w="680" w:type="dxa"/>
+              <w:tblBorders>
+                <w:top w:val="nil"/>
+                <w:left w:val="nil"/>
+                <w:bottom w:val="nil"/>
+                <w:right w:val="nil"/>
+                <w:insideH w:val="nil"/>
+                <w:insideV w:val="nil"/>
+              </w:tblBorders>
+            </w:tblPr>
+            <w:tblGrid>
+              <w:gridCol w:w="2636"/>
+            </w:tblGrid>
+            <w:tr>
+              <w:trPr>
+                <w:cantSplit/>
+              </w:trPr>
+              <w:tc>
+                <w:tcPr>
+                  <w:tcW w:type="dxa" w:w="2636"/>
+                  <w:tcMar>
+                    <w:top w:w="0" w:type="dxa"/>
+                    <w:left w:w="0" w:type="dxa"/>
+                    <w:bottom w:w="48" w:type="dxa"/>
+                    <w:right w:w="0" w:type="dxa"/>
+                  </w:tcMar>
+                </w:tcPr>
+                <w:p>
+                  <w:pPr>
+                    <w:keepLines/>
+                    <w:spacing w:before="0" w:after="10" w:line="240" w:lineRule="auto"/>
+                  </w:pPr>
+                  <w:r>
+                    <w:rPr>
+                      <w:rFonts w:ascii="Source Sans 3" w:hAnsi="Source Sans 3" w:eastAsia="Source Sans 3" w:cs="Source Sans 3"/>
+                      <w:b/>
+                      <w:i w:val="0"/>
+                      <w:color w:val="364F59"/>
+                      <w:sz w:val="11"/>
+                      <w:spacing w:val="10"/>
+                    </w:rPr>
+                    <w:t>PHONE</w:t>
+                  </w:r>
+                </w:p>
+                <w:p>
+                  <w:pPr>
+                    <w:keepLines/>
+                    <w:spacing w:before="0" w:after="0" w:line="240" w:lineRule="auto"/>
+                  </w:pPr>
+                  <w:hyperlink r:id="rId13">
+                    <w:r>
+                      <w:rPr>
+                        <w:rFonts w:ascii="Source Sans 3" w:hAnsi="Source Sans 3" w:eastAsia="Source Sans 3" w:cs="Source Sans 3"/>
+                        <w:color w:val="1F414D"/>
+                        <w:sz w:val="15"/>
+                        <w:szCs w:val="15"/>
+                      </w:rPr>
+                      <w:t>+261 34 13 539 78</w:t>
+                    </w:r>
+                  </w:hyperlink>
+                </w:p>
+              </w:tc>
+            </w:tr>
+            <w:tr>
+              <w:trPr>
+                <w:cantSplit/>
+              </w:trPr>
+              <w:tc>
+                <w:tcPr>
+                  <w:tcW w:type="dxa" w:w="2636"/>
+                  <w:tcMar>
+                    <w:top w:w="0" w:type="dxa"/>
+                    <w:left w:w="0" w:type="dxa"/>
+                    <w:bottom w:w="48" w:type="dxa"/>
+                    <w:right w:w="0" w:type="dxa"/>
+                  </w:tcMar>
+                </w:tcPr>
+                <w:p>
+                  <w:pPr>
+                    <w:keepLines/>
+                    <w:spacing w:before="0" w:after="10" w:line="240" w:lineRule="auto"/>
+                  </w:pPr>
+                  <w:r>
+                    <w:rPr>
+                      <w:rFonts w:ascii="Source Sans 3" w:hAnsi="Source Sans 3" w:eastAsia="Source Sans 3" w:cs="Source Sans 3"/>
+                      <w:b/>
+                      <w:i w:val="0"/>
+                      <w:color w:val="364F59"/>
+                      <w:sz w:val="11"/>
+                      <w:spacing w:val="10"/>
+                    </w:rPr>
+                    <w:t>EMAIL</w:t>
+                  </w:r>
+                </w:p>
+                <w:p>
+                  <w:pPr>
+                    <w:keepLines/>
+                    <w:spacing w:before="0" w:after="0" w:line="240" w:lineRule="auto"/>
+                  </w:pPr>
+                  <w:hyperlink r:id="rId14">
+                    <w:r>
+                      <w:rPr>
+                        <w:rFonts w:ascii="Source Sans 3" w:hAnsi="Source Sans 3" w:eastAsia="Source Sans 3" w:cs="Source Sans 3"/>
+                        <w:color w:val="1F414D"/>
+                        <w:sz w:val="15"/>
+                        <w:szCs w:val="15"/>
+                      </w:rPr>
+                      <w:t>locktohang@gmail.com</w:t>
+                    </w:r>
+                  </w:hyperlink>
+                </w:p>
+              </w:tc>
+            </w:tr>
+            <w:tr>
+              <w:trPr>
+                <w:cantSplit/>
+              </w:trPr>
+              <w:tc>
+                <w:tcPr>
+                  <w:tcW w:type="dxa" w:w="2636"/>
+                  <w:tcMar>
+                    <w:top w:w="0" w:type="dxa"/>
+                    <w:left w:w="0" w:type="dxa"/>
+                    <w:bottom w:w="48" w:type="dxa"/>
+                    <w:right w:w="0" w:type="dxa"/>
+                  </w:tcMar>
+                </w:tcPr>
+                <w:p>
+                  <w:pPr>
+                    <w:keepLines/>
+                    <w:spacing w:before="0" w:after="10" w:line="240" w:lineRule="auto"/>
+                  </w:pPr>
+                  <w:r>
+                    <w:rPr>
+                      <w:rFonts w:ascii="Source Sans 3" w:hAnsi="Source Sans 3" w:eastAsia="Source Sans 3" w:cs="Source Sans 3"/>
+                      <w:b/>
+                      <w:i w:val="0"/>
+                      <w:color w:val="364F59"/>
+                      <w:sz w:val="11"/>
+                      <w:spacing w:val="10"/>
+                    </w:rPr>
+                    <w:t>LOCATION</w:t>
+                  </w:r>
+                </w:p>
+                <w:p>
+                  <w:pPr>
+                    <w:keepLines/>
+                    <w:spacing w:before="0" w:after="0" w:line="240" w:lineRule="auto"/>
+                  </w:pPr>
+                  <w:r>
+                    <w:rPr>
+                      <w:rFonts w:ascii="Source Sans 3" w:hAnsi="Source Sans 3" w:eastAsia="Source Sans 3" w:cs="Source Sans 3"/>
+                      <w:b w:val="0"/>
+                      <w:i w:val="0"/>
+                      <w:color w:val="1F414D"/>
+                      <w:sz w:val="14"/>
+                    </w:rPr>
+                    <w:t>Antananarivo, Madagascar</w:t>
+                  </w:r>
+                </w:p>
+              </w:tc>
+            </w:tr>
+            <w:tr>
+              <w:trPr>
+                <w:cantSplit/>
+              </w:trPr>
+              <w:tc>
+                <w:tcPr>
+                  <w:tcW w:type="dxa" w:w="2636"/>
+                  <w:tcMar>
+                    <w:top w:w="0" w:type="dxa"/>
+                    <w:left w:w="0" w:type="dxa"/>
+                    <w:bottom w:w="48" w:type="dxa"/>
+                    <w:right w:w="0" w:type="dxa"/>
+                  </w:tcMar>
+                </w:tcPr>
+                <w:p>
+                  <w:pPr>
+                    <w:keepLines/>
+                    <w:spacing w:before="0" w:after="10" w:line="240" w:lineRule="auto"/>
+                  </w:pPr>
+                  <w:r>
+                    <w:rPr>
+                      <w:rFonts w:ascii="Source Sans 3" w:hAnsi="Source Sans 3" w:eastAsia="Source Sans 3" w:cs="Source Sans 3"/>
+                      <w:b/>
+                      <w:i w:val="0"/>
+                      <w:color w:val="364F59"/>
+                      <w:sz w:val="11"/>
+                      <w:spacing w:val="10"/>
+                    </w:rPr>
+                    <w:t>LINKEDIN</w:t>
+                  </w:r>
+                </w:p>
+                <w:p>
+                  <w:pPr>
+                    <w:keepLines/>
+                    <w:spacing w:before="0" w:after="0" w:line="240" w:lineRule="auto"/>
+                  </w:pPr>
+                  <w:hyperlink r:id="rId15">
+                    <w:r>
+                      <w:rPr>
+                        <w:rFonts w:ascii="Source Sans 3" w:hAnsi="Source Sans 3" w:eastAsia="Source Sans 3" w:cs="Source Sans 3"/>
+                        <w:color w:val="1F414D"/>
+                        <w:sz w:val="15"/>
+                        <w:szCs w:val="15"/>
+                      </w:rPr>
+                      <w:t>linkedin.com/in/angelo-lock-to-hang</w:t>
+                    </w:r>
+                  </w:hyperlink>
+                </w:p>
+              </w:tc>
+            </w:tr>
+            <w:tr>
+              <w:trPr>
+                <w:cantSplit/>
+              </w:trPr>
+              <w:tc>
+                <w:tcPr>
+                  <w:tcW w:type="dxa" w:w="2636"/>
+                  <w:tcMar>
+                    <w:top w:w="0" w:type="dxa"/>
+                    <w:left w:w="0" w:type="dxa"/>
+                    <w:bottom w:w="48" w:type="dxa"/>
+                    <w:right w:w="0" w:type="dxa"/>
+                  </w:tcMar>
+                </w:tcPr>
+                <w:p>
+                  <w:pPr>
+                    <w:keepLines/>
+                    <w:spacing w:before="0" w:after="10" w:line="240" w:lineRule="auto"/>
+                  </w:pPr>
+                  <w:r>
+                    <w:rPr>
+                      <w:rFonts w:ascii="Source Sans 3" w:hAnsi="Source Sans 3" w:eastAsia="Source Sans 3" w:cs="Source Sans 3"/>
+                      <w:b/>
+                      <w:i w:val="0"/>
+                      <w:color w:val="364F59"/>
+                      <w:sz w:val="11"/>
+                      <w:spacing w:val="10"/>
+                    </w:rPr>
+                    <w:t>GITHUB</w:t>
+                  </w:r>
+                </w:p>
+                <w:p>
+                  <w:pPr>
+                    <w:keepLines/>
+                    <w:spacing w:before="0" w:after="0" w:line="240" w:lineRule="auto"/>
+                  </w:pPr>
+                  <w:hyperlink r:id="rId16">
+                    <w:r>
+                      <w:rPr>
+                        <w:rFonts w:ascii="Source Sans 3" w:hAnsi="Source Sans 3" w:eastAsia="Source Sans 3" w:cs="Source Sans 3"/>
+                        <w:color w:val="1F414D"/>
+                        <w:sz w:val="15"/>
+                        <w:szCs w:val="15"/>
+                      </w:rPr>
+                      <w:t>github.com/angelolockdev</w:t>
+                    </w:r>
+                  </w:hyperlink>
+                </w:p>
+              </w:tc>
+            </w:tr>
+          </w:tbl>
+          <w:p>
+            <w:pPr>
+              <w:spacing w:before="0" w:after="0" w:line="240" w:lineRule="auto"/>
+              <w:ind w:left="680" w:right="482"/>
+            </w:pPr>
+            <w:r>
+              <w:rPr>
+                <w:rFonts w:ascii="Source Sans 3" w:hAnsi="Source Sans 3" w:eastAsia="Source Sans 3" w:cs="Source Sans 3"/>
+                <w:b w:val="0"/>
+                <w:i w:val="0"/>
+                <w:color w:val="465E67"/>
+                <w:sz w:val="2"/>
+              </w:rPr>
+              <w:t xml:space="preserve"> </w:t>
+            </w:r>
+          </w:p>
+          <w:p>
+            <w:pPr>
+              <w:keepNext/>
+              <w:keepLines/>
+              <w:spacing w:before="64" w:after="0" w:line="240" w:lineRule="auto"/>
+              <w:ind w:left="680" w:right="482"/>
+            </w:pPr>
+            <w:r>
+              <w:drawing>
+                <wp:inline xmlns:a="http://schemas.openxmlformats.org/drawingml/2006/main" xmlns:pic="http://schemas.openxmlformats.org/drawingml/2006/picture">
+                  <wp:extent cx="104400" cy="104400"/>
+                  <wp:docPr id="4" name="Picture 4"/>
+                  <wp:cNvGraphicFramePr>
+                    <a:graphicFrameLocks noChangeAspect="1"/>
+                  </wp:cNvGraphicFramePr>
+                  <a:graphic>
+                    <a:graphicData uri="http://schemas.openxmlformats.org/drawingml/2006/picture">
+                      <pic:pic>
+                        <pic:nvPicPr>
+                          <pic:cNvPr id="0" name="skills.png"/>
+                          <pic:cNvPicPr/>
+                        </pic:nvPicPr>
+                        <pic:blipFill>
+                          <a:blip r:embed="rId17"/>
+                          <a:stretch>
+                            <a:fillRect/>
+                          </a:stretch>
+                        </pic:blipFill>
+                        <pic:spPr>
+                          <a:xfrm>
+                            <a:off x="0" y="0"/>
+                            <a:ext cx="104400" cy="104400"/>
+                          </a:xfrm>
+                          <a:prstGeom prst="rect"/>
+                        </pic:spPr>
+                      </pic:pic>
+                    </a:graphicData>
+                  </a:graphic>
+                </wp:inline>
+              </w:drawing>
+            </w:r>
+            <w:r>
+              <w:rPr>
+                <w:rFonts w:ascii="Source Sans 3" w:hAnsi="Source Sans 3" w:eastAsia="Source Sans 3" w:cs="Source Sans 3"/>
+                <w:b w:val="0"/>
+                <w:i w:val="0"/>
+                <w:color w:val="173F4B"/>
+                <w:sz w:val="4"/>
+              </w:rPr>
+              <w:t xml:space="preserve">  </w:t>
+            </w:r>
+            <w:r>
+              <w:rPr>
+                <w:rFonts w:ascii="Source Sans 3" w:hAnsi="Source Sans 3" w:eastAsia="Source Sans 3" w:cs="Source Sans 3"/>
+                <w:b/>
+                <w:i w:val="0"/>
+                <w:color w:val="173F4B"/>
+                <w:sz w:val="17"/>
+                <w:spacing w:val="18"/>
+              </w:rPr>
+              <w:t>SKILLS</w:t>
+            </w:r>
+          </w:p>
+          <w:p>
+            <w:pPr>
+              <w:keepLines w:val="0"/>
+              <w:spacing w:before="8" w:after="64" w:line="240" w:lineRule="auto"/>
+              <w:ind w:right="482" w:left="680"/>
+              <w:pBdr>
+                <w:bottom w:val="single" w:sz="5" w:space="0" w:color="8FA8B2"/>
+              </w:pBdr>
+            </w:pPr>
+            <w:r>
+              <w:rPr>
+                <w:rFonts w:ascii="Source Sans 3" w:hAnsi="Source Sans 3" w:eastAsia="Source Sans 3" w:cs="Source Sans 3"/>
+                <w:b w:val="0"/>
+                <w:i w:val="0"/>
+                <w:color w:val="173F4B"/>
+                <w:sz w:val="2"/>
+              </w:rPr>
+              <w:t xml:space="preserve"> </w:t>
+            </w:r>
+          </w:p>
+          <w:p>
+            <w:pPr>
+              <w:keepNext/>
+              <w:keepLines/>
+              <w:spacing w:before="0" w:after="4" w:line="240" w:lineRule="auto"/>
+              <w:ind w:left="680" w:right="482"/>
+            </w:pPr>
+            <w:r>
+              <w:rPr>
+                <w:rFonts w:ascii="Source Sans 3" w:hAnsi="Source Sans 3" w:eastAsia="Source Sans 3" w:cs="Source Sans 3"/>
+                <w:b/>
+                <w:i w:val="0"/>
+                <w:color w:val="173F4B"/>
+                <w:sz w:val="15"/>
+              </w:rPr>
+              <w:t>PHP &amp; Back-end</w:t>
+            </w:r>
+          </w:p>
+          <w:p>
+            <w:pPr>
+              <w:keepLines/>
+              <w:spacing w:before="0" w:after="84" w:line="240" w:lineRule="auto"/>
+              <w:ind w:left="680" w:right="482"/>
+            </w:pPr>
+            <w:r>
+              <w:rPr>
+                <w:rFonts w:ascii="Source Sans 3" w:hAnsi="Source Sans 3" w:eastAsia="Source Sans 3" w:cs="Source Sans 3"/>
+                <w:b w:val="0"/>
+                <w:i w:val="0"/>
+                <w:color w:val="1F414D"/>
+                <w:sz w:val="14"/>
+              </w:rPr>
+              <w:t>PHP · Laravel · Symfony · REST API · WordPress</w:t>
+            </w:r>
+          </w:p>
+          <w:p>
+            <w:pPr>
+              <w:keepNext/>
+              <w:keepLines/>
+              <w:spacing w:before="0" w:after="4" w:line="240" w:lineRule="auto"/>
+              <w:ind w:left="680" w:right="482"/>
+            </w:pPr>
+            <w:r>
+              <w:rPr>
+                <w:rFonts w:ascii="Source Sans 3" w:hAnsi="Source Sans 3" w:eastAsia="Source Sans 3" w:cs="Source Sans 3"/>
+                <w:b/>
+                <w:i w:val="0"/>
+                <w:color w:val="173F4B"/>
+                <w:sz w:val="15"/>
+              </w:rPr>
+              <w:t>Data</w:t>
+            </w:r>
+          </w:p>
+          <w:p>
+            <w:pPr>
+              <w:keepLines/>
+              <w:spacing w:before="0" w:after="84" w:line="240" w:lineRule="auto"/>
+              <w:ind w:left="680" w:right="482"/>
+            </w:pPr>
+            <w:r>
+              <w:rPr>
+                <w:rFonts w:ascii="Source Sans 3" w:hAnsi="Source Sans 3" w:eastAsia="Source Sans 3" w:cs="Source Sans 3"/>
+                <w:b w:val="0"/>
+                <w:i w:val="0"/>
+                <w:color w:val="1F414D"/>
+                <w:sz w:val="14"/>
+              </w:rPr>
+              <w:t>MySQL · PostgreSQL · PL/SQL · Redis · Supabase</w:t>
+            </w:r>
+          </w:p>
+          <w:p>
+            <w:pPr>
+              <w:keepNext/>
+              <w:keepLines/>
+              <w:spacing w:before="0" w:after="4" w:line="240" w:lineRule="auto"/>
+              <w:ind w:left="680" w:right="482"/>
+            </w:pPr>
+            <w:r>
+              <w:rPr>
+                <w:rFonts w:ascii="Source Sans 3" w:hAnsi="Source Sans 3" w:eastAsia="Source Sans 3" w:cs="Source Sans 3"/>
+                <w:b/>
+                <w:i w:val="0"/>
+                <w:color w:val="173F4B"/>
+                <w:sz w:val="15"/>
+              </w:rPr>
+              <w:t>Applied AI</w:t>
+            </w:r>
+          </w:p>
+          <w:p>
+            <w:pPr>
+              <w:keepLines/>
+              <w:spacing w:before="0" w:after="84" w:line="240" w:lineRule="auto"/>
+              <w:ind w:left="680" w:right="482"/>
+            </w:pPr>
+            <w:r>
+              <w:rPr>
+                <w:rFonts w:ascii="Source Sans 3" w:hAnsi="Source Sans 3" w:eastAsia="Source Sans 3" w:cs="Source Sans 3"/>
+                <w:b w:val="0"/>
+                <w:i w:val="0"/>
+                <w:color w:val="1F414D"/>
+                <w:sz w:val="14"/>
+              </w:rPr>
+              <w:t>RAG · Vector Search · AI Agents · LLM</w:t>
+            </w:r>
+          </w:p>
+          <w:p>
+            <w:pPr>
+              <w:keepNext/>
+              <w:keepLines/>
+              <w:spacing w:before="0" w:after="4" w:line="240" w:lineRule="auto"/>
+              <w:ind w:left="680" w:right="482"/>
+            </w:pPr>
+            <w:r>
+              <w:rPr>
+                <w:rFonts w:ascii="Source Sans 3" w:hAnsi="Source Sans 3" w:eastAsia="Source Sans 3" w:cs="Source Sans 3"/>
+                <w:b/>
+                <w:i w:val="0"/>
+                <w:color w:val="173F4B"/>
+                <w:sz w:val="15"/>
+              </w:rPr>
+              <w:t>Quality &amp; architecture</w:t>
+            </w:r>
+          </w:p>
+          <w:p>
+            <w:pPr>
+              <w:keepLines/>
+              <w:spacing w:before="0" w:after="84" w:line="240" w:lineRule="auto"/>
+              <w:ind w:left="680" w:right="482"/>
+            </w:pPr>
+            <w:r>
+              <w:rPr>
+                <w:rFonts w:ascii="Source Sans 3" w:hAnsi="Source Sans 3" w:eastAsia="Source Sans 3" w:cs="Source Sans 3"/>
+                <w:b w:val="0"/>
+                <w:i w:val="0"/>
+                <w:color w:val="1F414D"/>
+                <w:sz w:val="14"/>
+              </w:rPr>
+              <w:t>Unit testing · Functional testing · Clean Architecture · Application security</w:t>
+            </w:r>
+          </w:p>
+          <w:p>
+            <w:pPr>
+              <w:keepNext/>
+              <w:keepLines/>
+              <w:spacing w:before="0" w:after="4" w:line="240" w:lineRule="auto"/>
+              <w:ind w:left="680" w:right="482"/>
+            </w:pPr>
+            <w:r>
+              <w:rPr>
+                <w:rFonts w:ascii="Source Sans 3" w:hAnsi="Source Sans 3" w:eastAsia="Source Sans 3" w:cs="Source Sans 3"/>
+                <w:b/>
+                <w:i w:val="0"/>
+                <w:color w:val="173F4B"/>
+                <w:sz w:val="15"/>
+              </w:rPr>
+              <w:t>DevOps &amp; delivery</w:t>
+            </w:r>
+          </w:p>
+          <w:p>
+            <w:pPr>
+              <w:keepLines/>
+              <w:spacing w:before="0" w:after="84" w:line="240" w:lineRule="auto"/>
+              <w:ind w:left="680" w:right="482"/>
+            </w:pPr>
+            <w:r>
+              <w:rPr>
+                <w:rFonts w:ascii="Source Sans 3" w:hAnsi="Source Sans 3" w:eastAsia="Source Sans 3" w:cs="Source Sans 3"/>
+                <w:b w:val="0"/>
+                <w:i w:val="0"/>
+                <w:color w:val="1F414D"/>
+                <w:sz w:val="14"/>
+              </w:rPr>
+              <w:t>Docker · GitHub Actions · Bitbucket Pipelines · CI/CD · Linux</w:t>
+            </w:r>
+          </w:p>
+          <w:p>
+            <w:pPr>
+              <w:keepNext/>
+              <w:keepLines/>
+              <w:spacing w:before="0" w:after="4" w:line="240" w:lineRule="auto"/>
+              <w:ind w:left="680" w:right="482"/>
+            </w:pPr>
+            <w:r>
+              <w:rPr>
+                <w:rFonts w:ascii="Source Sans 3" w:hAnsi="Source Sans 3" w:eastAsia="Source Sans 3" w:cs="Source Sans 3"/>
+                <w:b/>
+                <w:i w:val="0"/>
+                <w:color w:val="173F4B"/>
+                <w:sz w:val="15"/>
+              </w:rPr>
+              <w:t>Additional</w:t>
+            </w:r>
+          </w:p>
+          <w:p>
+            <w:pPr>
+              <w:keepLines/>
+              <w:spacing w:before="0" w:after="84" w:line="240" w:lineRule="auto"/>
+              <w:ind w:left="680" w:right="482"/>
+            </w:pPr>
+            <w:r>
+              <w:rPr>
+                <w:rFonts w:ascii="Source Sans 3" w:hAnsi="Source Sans 3" w:eastAsia="Source Sans 3" w:cs="Source Sans 3"/>
+                <w:b w:val="0"/>
+                <w:i w:val="0"/>
+                <w:color w:val="1F414D"/>
+                <w:sz w:val="14"/>
+              </w:rPr>
+              <w:t>Python · TypeScript · Flutter</w:t>
+            </w:r>
+          </w:p>
+          <w:p>
+            <w:pPr>
+              <w:keepNext/>
+              <w:keepLines/>
+              <w:spacing w:before="0" w:after="4" w:line="240" w:lineRule="auto"/>
+              <w:ind w:left="680" w:right="482"/>
+            </w:pPr>
+            <w:r>
+              <w:rPr>
+                <w:rFonts w:ascii="Source Sans 3" w:hAnsi="Source Sans 3" w:eastAsia="Source Sans 3" w:cs="Source Sans 3"/>
+                <w:b/>
+                <w:i w:val="0"/>
+                <w:color w:val="173F4B"/>
+                <w:sz w:val="15"/>
+              </w:rPr>
+              <w:t>Ways of working</w:t>
+            </w:r>
+          </w:p>
+          <w:p>
+            <w:pPr>
+              <w:keepLines/>
+              <w:spacing w:before="0" w:after="84" w:line="240" w:lineRule="auto"/>
+              <w:ind w:left="680" w:right="482"/>
+            </w:pPr>
+            <w:r>
+              <w:rPr>
+                <w:rFonts w:ascii="Source Sans 3" w:hAnsi="Source Sans 3" w:eastAsia="Source Sans 3" w:cs="Source Sans 3"/>
+                <w:b w:val="0"/>
+                <w:i w:val="0"/>
+                <w:color w:val="1F414D"/>
+                <w:sz w:val="14"/>
+              </w:rPr>
+              <w:t>Agile / Scrum · Teamwork</w:t>
+            </w:r>
+          </w:p>
+          <w:p>
+            <w:pPr>
+              <w:keepNext/>
+              <w:keepLines/>
+              <w:spacing w:before="44" w:after="0" w:line="240" w:lineRule="auto"/>
+              <w:ind w:left="680" w:right="482"/>
+            </w:pPr>
+            <w:r>
+              <w:drawing>
+                <wp:inline xmlns:a="http://schemas.openxmlformats.org/drawingml/2006/main" xmlns:pic="http://schemas.openxmlformats.org/drawingml/2006/picture">
+                  <wp:extent cx="104400" cy="104400"/>
+                  <wp:docPr id="5" name="Picture 5"/>
+                  <wp:cNvGraphicFramePr>
+                    <a:graphicFrameLocks noChangeAspect="1"/>
+                  </wp:cNvGraphicFramePr>
+                  <a:graphic>
+                    <a:graphicData uri="http://schemas.openxmlformats.org/drawingml/2006/picture">
+                      <pic:pic>
+                        <pic:nvPicPr>
+                          <pic:cNvPr id="0" name="languages.png"/>
+                          <pic:cNvPicPr/>
+                        </pic:nvPicPr>
+                        <pic:blipFill>
+                          <a:blip r:embed="rId18"/>
+                          <a:stretch>
+                            <a:fillRect/>
+                          </a:stretch>
+                        </pic:blipFill>
+                        <pic:spPr>
+                          <a:xfrm>
+                            <a:off x="0" y="0"/>
+                            <a:ext cx="104400" cy="104400"/>
+                          </a:xfrm>
+                          <a:prstGeom prst="rect"/>
+                        </pic:spPr>
+                      </pic:pic>
+                    </a:graphicData>
+                  </a:graphic>
+                </wp:inline>
+              </w:drawing>
+            </w:r>
+            <w:r>
+              <w:rPr>
+                <w:rFonts w:ascii="Source Sans 3" w:hAnsi="Source Sans 3" w:eastAsia="Source Sans 3" w:cs="Source Sans 3"/>
+                <w:b w:val="0"/>
+                <w:i w:val="0"/>
+                <w:color w:val="173F4B"/>
+                <w:sz w:val="4"/>
+              </w:rPr>
+              <w:t xml:space="preserve">  </w:t>
+            </w:r>
+            <w:r>
+              <w:rPr>
+                <w:rFonts w:ascii="Source Sans 3" w:hAnsi="Source Sans 3" w:eastAsia="Source Sans 3" w:cs="Source Sans 3"/>
+                <w:b/>
+                <w:i w:val="0"/>
+                <w:color w:val="173F4B"/>
+                <w:sz w:val="17"/>
+                <w:spacing w:val="18"/>
+              </w:rPr>
+              <w:t>LANGUAGES</w:t>
+            </w:r>
+          </w:p>
+          <w:p>
+            <w:pPr>
+              <w:keepLines w:val="0"/>
+              <w:spacing w:before="8" w:after="56" w:line="240" w:lineRule="auto"/>
+              <w:ind w:right="482" w:left="680"/>
+              <w:pBdr>
+                <w:bottom w:val="single" w:sz="5" w:space="0" w:color="8FA8B2"/>
+              </w:pBdr>
+            </w:pPr>
+            <w:r>
+              <w:rPr>
+                <w:rFonts w:ascii="Source Sans 3" w:hAnsi="Source Sans 3" w:eastAsia="Source Sans 3" w:cs="Source Sans 3"/>
+                <w:b w:val="0"/>
+                <w:i w:val="0"/>
+                <w:color w:val="173F4B"/>
+                <w:sz w:val="2"/>
+              </w:rPr>
+              <w:t xml:space="preserve"> </w:t>
+            </w:r>
+          </w:p>
+          <w:tbl>
+            <w:tblPr>
+              <w:tblW w:type="dxa" w:w="2636"/>
+              <w:jc w:val="left"/>
+              <w:tblLayout w:type="fixed"/>
+              <w:tblLook w:firstColumn="1" w:firstRow="1" w:lastColumn="0" w:lastRow="0" w:noHBand="0" w:noVBand="1" w:val="04A0"/>
+              <w:tblInd w:w="680" w:type="dxa"/>
+              <w:tblBorders>
+                <w:top w:val="nil"/>
+                <w:left w:val="nil"/>
+                <w:bottom w:val="nil"/>
+                <w:right w:val="nil"/>
+                <w:insideH w:val="nil"/>
+                <w:insideV w:val="nil"/>
+              </w:tblBorders>
+            </w:tblPr>
+            <w:tblGrid>
+              <w:gridCol w:w="1247"/>
+              <w:gridCol w:w="1389"/>
+            </w:tblGrid>
+            <w:tr>
+              <w:trPr>
+                <w:cantSplit/>
+              </w:trPr>
+              <w:tc>
+                <w:tcPr>
+                  <w:tcW w:type="dxa" w:w="1247"/>
+                  <w:tcMar>
+                    <w:top w:w="0" w:type="dxa"/>
+                    <w:left w:w="0" w:type="dxa"/>
+                    <w:bottom w:w="24" w:type="dxa"/>
+                    <w:right w:w="0" w:type="dxa"/>
+                  </w:tcMar>
+                </w:tcPr>
+                <w:p>
+                  <w:pPr>
+                    <w:keepLines w:val="0"/>
+                    <w:spacing w:before="0" w:after="0" w:line="240" w:lineRule="auto"/>
+                  </w:pPr>
+                  <w:r>
+                    <w:rPr>
+                      <w:rFonts w:ascii="Source Sans 3" w:hAnsi="Source Sans 3" w:eastAsia="Source Sans 3" w:cs="Source Sans 3"/>
+                      <w:b/>
+                      <w:i w:val="0"/>
+                      <w:color w:val="173F4B"/>
+                      <w:sz w:val="14"/>
+                    </w:rPr>
+                    <w:t>French</w:t>
+                  </w:r>
+                </w:p>
+              </w:tc>
+              <w:tc>
+                <w:tcPr>
+                  <w:tcW w:type="dxa" w:w="1389"/>
+                  <w:tcMar>
+                    <w:top w:w="0" w:type="dxa"/>
+                    <w:left w:w="0" w:type="dxa"/>
+                    <w:bottom w:w="24" w:type="dxa"/>
+                    <w:right w:w="0" w:type="dxa"/>
+                  </w:tcMar>
+                </w:tcPr>
+                <w:p>
+                  <w:pPr>
+                    <w:keepLines w:val="0"/>
+                    <w:spacing w:before="0" w:after="0" w:line="240" w:lineRule="auto"/>
+                    <w:jc w:val="right"/>
+                  </w:pPr>
+                  <w:r>
+                    <w:rPr>
+                      <w:rFonts w:ascii="Source Sans 3" w:hAnsi="Source Sans 3" w:eastAsia="Source Sans 3" w:cs="Source Sans 3"/>
+                      <w:b w:val="0"/>
+                      <w:i w:val="0"/>
+                      <w:color w:val="364F59"/>
+                      <w:sz w:val="14"/>
+                    </w:rPr>
+                    <w:t>C1 - Proficient</w:t>
+                  </w:r>
+                </w:p>
+              </w:tc>
+            </w:tr>
+            <w:tr>
+              <w:trPr>
+                <w:cantSplit/>
+              </w:trPr>
+              <w:tc>
+                <w:tcPr>
+                  <w:tcW w:type="dxa" w:w="1247"/>
+                  <w:tcMar>
+                    <w:top w:w="0" w:type="dxa"/>
+                    <w:left w:w="0" w:type="dxa"/>
+                    <w:bottom w:w="24" w:type="dxa"/>
+                    <w:right w:w="0" w:type="dxa"/>
+                  </w:tcMar>
+                </w:tcPr>
+                <w:p>
+                  <w:pPr>
+                    <w:keepLines w:val="0"/>
+                    <w:spacing w:before="0" w:after="0" w:line="240" w:lineRule="auto"/>
+                  </w:pPr>
+                  <w:r>
+                    <w:rPr>
+                      <w:rFonts w:ascii="Source Sans 3" w:hAnsi="Source Sans 3" w:eastAsia="Source Sans 3" w:cs="Source Sans 3"/>
+                      <w:b/>
+                      <w:i w:val="0"/>
+                      <w:color w:val="173F4B"/>
+                      <w:sz w:val="14"/>
+                    </w:rPr>
+                    <w:t>English</w:t>
+                  </w:r>
+                </w:p>
+              </w:tc>
+              <w:tc>
+                <w:tcPr>
+                  <w:tcW w:type="dxa" w:w="1389"/>
+                  <w:tcMar>
+                    <w:top w:w="0" w:type="dxa"/>
+                    <w:left w:w="0" w:type="dxa"/>
+                    <w:bottom w:w="24" w:type="dxa"/>
+                    <w:right w:w="0" w:type="dxa"/>
+                  </w:tcMar>
+                </w:tcPr>
+                <w:p>
+                  <w:pPr>
+                    <w:keepLines w:val="0"/>
+                    <w:spacing w:before="0" w:after="0" w:line="240" w:lineRule="auto"/>
+                    <w:jc w:val="right"/>
+                  </w:pPr>
+                  <w:r>
+                    <w:rPr>
+                      <w:rFonts w:ascii="Source Sans 3" w:hAnsi="Source Sans 3" w:eastAsia="Source Sans 3" w:cs="Source Sans 3"/>
+                      <w:b w:val="0"/>
+                      <w:i w:val="0"/>
+                      <w:color w:val="364F59"/>
+                      <w:sz w:val="14"/>
+                    </w:rPr>
+                    <w:t>B1 - Intermediate</w:t>
+                  </w:r>
+                </w:p>
+              </w:tc>
+            </w:tr>
+            <w:tr>
+              <w:trPr>
+                <w:cantSplit/>
+              </w:trPr>
+              <w:tc>
+                <w:tcPr>
+                  <w:tcW w:type="dxa" w:w="1247"/>
+                  <w:tcMar>
+                    <w:top w:w="0" w:type="dxa"/>
+                    <w:left w:w="0" w:type="dxa"/>
+                    <w:bottom w:w="24" w:type="dxa"/>
+                    <w:right w:w="0" w:type="dxa"/>
+                  </w:tcMar>
+                </w:tcPr>
+                <w:p>
+                  <w:pPr>
+                    <w:keepLines w:val="0"/>
+                    <w:spacing w:before="0" w:after="0" w:line="240" w:lineRule="auto"/>
+                  </w:pPr>
+                  <w:r>
+                    <w:rPr>
+                      <w:rFonts w:ascii="Source Sans 3" w:hAnsi="Source Sans 3" w:eastAsia="Source Sans 3" w:cs="Source Sans 3"/>
+                      <w:b/>
+                      <w:i w:val="0"/>
+                      <w:color w:val="173F4B"/>
+                      <w:sz w:val="14"/>
+                    </w:rPr>
+                    <w:t>Malagasy</w:t>
+                  </w:r>
+                </w:p>
+              </w:tc>
+              <w:tc>
+                <w:tcPr>
+                  <w:tcW w:type="dxa" w:w="1389"/>
+                  <w:tcMar>
+                    <w:top w:w="0" w:type="dxa"/>
+                    <w:left w:w="0" w:type="dxa"/>
+                    <w:bottom w:w="24" w:type="dxa"/>
+                    <w:right w:w="0" w:type="dxa"/>
+                  </w:tcMar>
+                </w:tcPr>
+                <w:p>
+                  <w:pPr>
+                    <w:keepLines w:val="0"/>
+                    <w:spacing w:before="0" w:after="0" w:line="240" w:lineRule="auto"/>
+                    <w:jc w:val="right"/>
+                  </w:pPr>
+                  <w:r>
+                    <w:rPr>
+                      <w:rFonts w:ascii="Source Sans 3" w:hAnsi="Source Sans 3" w:eastAsia="Source Sans 3" w:cs="Source Sans 3"/>
+                      <w:b w:val="0"/>
+                      <w:i w:val="0"/>
+                      <w:color w:val="364F59"/>
+                      <w:sz w:val="14"/>
+                    </w:rPr>
+                    <w:t>Native</w:t>
+                  </w:r>
+                </w:p>
+              </w:tc>
+            </w:tr>
+          </w:tbl>
+          <w:p>
+            <w:pPr>
+              <w:spacing w:before="0" w:after="0" w:line="240" w:lineRule="auto"/>
+              <w:ind w:left="680" w:right="482"/>
+            </w:pPr>
+            <w:r>
+              <w:rPr>
+                <w:rFonts w:ascii="Source Sans 3" w:hAnsi="Source Sans 3" w:eastAsia="Source Sans 3" w:cs="Source Sans 3"/>
+                <w:b w:val="0"/>
+                <w:i w:val="0"/>
+                <w:color w:val="465E67"/>
+                <w:sz w:val="2"/>
+              </w:rPr>
+              <w:t xml:space="preserve"> </w:t>
+            </w:r>
+          </w:p>
+        </w:tc>
+        <w:tc>
+          <w:tcPr>
+            <w:tcW w:type="dxa" w:w="8107"/>
+            <w:vAlign w:val="top"/>
+            <w:shd w:val="clear" w:color="auto" w:fill="F4F4F4"/>
+            <w:tcMar>
+              <w:top w:w="540" w:type="dxa"/>
+              <w:left w:w="0" w:type="dxa"/>
+              <w:bottom w:w="470" w:type="dxa"/>
+              <w:right w:w="0" w:type="dxa"/>
+            </w:tcMar>
+          </w:tcPr>
+          <w:p>
+            <w:pPr>
+              <w:keepLines w:val="0"/>
+              <w:spacing w:before="0" w:after="60" w:line="240" w:lineRule="auto"/>
+              <w:ind w:left="680" w:right="737"/>
+            </w:pPr>
+            <w:r>
+              <w:rPr>
+                <w:rFonts w:ascii="Source Sans 3" w:hAnsi="Source Sans 3" w:eastAsia="Source Sans 3" w:cs="Source Sans 3"/>
+                <w:b w:val="0"/>
+                <w:i w:val="0"/>
+                <w:color w:val="2A4650"/>
+                <w:sz w:val="15"/>
+                <w:spacing w:val="18"/>
+              </w:rPr>
+              <w:t>FULLSTACK · PHP / LARAVEL · APPLIED AI</w:t>
+            </w:r>
+          </w:p>
+          <w:p>
+            <w:pPr>
+              <w:keepLines w:val="0"/>
+              <w:spacing w:before="0" w:after="40" w:line="240" w:lineRule="auto"/>
+              <w:ind w:left="680" w:right="737"/>
+            </w:pPr>
+            <w:r>
+              <w:rPr>
+                <w:rFonts w:ascii="Source Serif 4" w:hAnsi="Source Serif 4" w:eastAsia="Source Serif 4" w:cs="Source Serif 4"/>
+                <w:b w:val="0"/>
+                <w:i w:val="0"/>
+                <w:color w:val="173F4B"/>
+                <w:sz w:val="53"/>
+              </w:rPr>
+              <w:t>Angelo Lock To Hang</w:t>
+            </w:r>
+          </w:p>
+          <w:p>
+            <w:pPr>
+              <w:keepLines w:val="0"/>
+              <w:spacing w:before="0" w:after="50" w:line="240" w:lineRule="auto"/>
+              <w:ind w:left="680" w:right="737"/>
+            </w:pPr>
+            <w:r>
+              <w:rPr>
+                <w:rFonts w:ascii="Source Sans 3" w:hAnsi="Source Sans 3" w:eastAsia="Source Sans 3" w:cs="Source Sans 3"/>
+                <w:b/>
+                <w:i w:val="0"/>
+                <w:color w:val="173F4B"/>
+                <w:sz w:val="19"/>
+              </w:rPr>
+              <w:t>Fullstack PHP/Laravel Developer &amp; AI Engineer</w:t>
+            </w:r>
+          </w:p>
+          <w:p>
+            <w:pPr>
+              <w:keepLines w:val="0"/>
+              <w:spacing w:before="12" w:after="70" w:line="240" w:lineRule="auto"/>
+              <w:ind w:right="6690" w:left="680"/>
+              <w:pBdr>
+                <w:bottom w:val="single" w:sz="5" w:space="0" w:color="173F4B"/>
+              </w:pBdr>
+            </w:pPr>
+            <w:r>
+              <w:rPr>
+                <w:rFonts w:ascii="Source Sans 3" w:hAnsi="Source Sans 3" w:eastAsia="Source Sans 3" w:cs="Source Sans 3"/>
+                <w:b w:val="0"/>
+                <w:i w:val="0"/>
+                <w:color w:val="173F4B"/>
+                <w:sz w:val="2"/>
+              </w:rPr>
+              <w:t xml:space="preserve"> </w:t>
+            </w:r>
+          </w:p>
+          <w:p>
+            <w:pPr>
+              <w:keepLines/>
+              <w:spacing w:before="0" w:after="0" w:line="259" w:lineRule="auto"/>
+              <w:ind w:left="680" w:right="737"/>
+            </w:pPr>
+            <w:r>
+              <w:rPr>
+                <w:rFonts w:ascii="Source Sans 3" w:hAnsi="Source Sans 3" w:eastAsia="Source Sans 3" w:cs="Source Sans 3"/>
+                <w:b w:val="0"/>
+                <w:i w:val="0"/>
+                <w:color w:val="2A4650"/>
+                <w:sz w:val="16"/>
+              </w:rPr>
+              <w:t>Fullstack Developer with 6+ years of experience in PHP, Laravel and Symfony. Builds web applications, APIs and platforms integrating RAG and AI agents. Delivered 50+ projects with consistent attention to architecture, security, testing and reliable deployments.</w:t>
+            </w:r>
+          </w:p>
+        </w:tc>
+      </w:tr>
+      <w:tr>
+        <w:trPr>
+          <w:trHeight w:val="11792" w:hRule="exact"/>
+        </w:trPr>
+        <w:tc>
+          <w:tcPr>
+            <w:tcW w:type="dxa" w:w="3798"/>
+            <w:vMerge/>
+          </w:tcPr>
+          <w:p/>
+        </w:tc>
+        <w:tc>
+          <w:tcPr>
+            <w:tcW w:type="dxa" w:w="8107"/>
+            <w:vAlign w:val="top"/>
+            <w:shd w:val="clear" w:color="auto" w:fill="FFFFFF"/>
+            <w:tcMar>
+              <w:top w:w="540" w:type="dxa"/>
+              <w:left w:w="0" w:type="dxa"/>
+              <w:bottom w:w="482" w:type="dxa"/>
+              <w:right w:w="0" w:type="dxa"/>
+            </w:tcMar>
+          </w:tcPr>
+          <w:p>
+            <w:pPr>
+              <w:keepNext/>
+              <w:keepLines/>
+              <w:spacing w:before="0" w:after="0" w:line="240" w:lineRule="auto"/>
+              <w:ind w:left="680" w:right="737"/>
+            </w:pPr>
+            <w:r>
+              <w:drawing>
+                <wp:inline xmlns:a="http://schemas.openxmlformats.org/drawingml/2006/main" xmlns:pic="http://schemas.openxmlformats.org/drawingml/2006/picture">
+                  <wp:extent cx="104400" cy="104400"/>
+                  <wp:docPr id="6" name="Picture 6"/>
+                  <wp:cNvGraphicFramePr>
+                    <a:graphicFrameLocks noChangeAspect="1"/>
+                  </wp:cNvGraphicFramePr>
+                  <a:graphic>
+                    <a:graphicData uri="http://schemas.openxmlformats.org/drawingml/2006/picture">
+                      <pic:pic>
+                        <pic:nvPicPr>
+                          <pic:cNvPr id="0" name="experience.png"/>
+                          <pic:cNvPicPr/>
+                        </pic:nvPicPr>
+                        <pic:blipFill>
+                          <a:blip r:embed="rId19"/>
+                          <a:stretch>
+                            <a:fillRect/>
+                          </a:stretch>
+                        </pic:blipFill>
+                        <pic:spPr>
+                          <a:xfrm>
+                            <a:off x="0" y="0"/>
+                            <a:ext cx="104400" cy="104400"/>
+                          </a:xfrm>
+                          <a:prstGeom prst="rect"/>
+                        </pic:spPr>
+                      </pic:pic>
+                    </a:graphicData>
+                  </a:graphic>
+                </wp:inline>
+              </w:drawing>
+            </w:r>
+            <w:r>
+              <w:rPr>
+                <w:rFonts w:ascii="Source Sans 3" w:hAnsi="Source Sans 3" w:eastAsia="Source Sans 3" w:cs="Source Sans 3"/>
+                <w:b w:val="0"/>
+                <w:i w:val="0"/>
+                <w:color w:val="173F4B"/>
+                <w:sz w:val="4"/>
+              </w:rPr>
+              <w:t xml:space="preserve">  </w:t>
+            </w:r>
+            <w:r>
+              <w:rPr>
+                <w:rFonts w:ascii="Source Sans 3" w:hAnsi="Source Sans 3" w:eastAsia="Source Sans 3" w:cs="Source Sans 3"/>
+                <w:b/>
+                <w:i w:val="0"/>
+                <w:color w:val="173F4B"/>
+                <w:sz w:val="17"/>
+                <w:spacing w:val="18"/>
+              </w:rPr>
+              <w:t>EXPERIENCE</w:t>
+            </w:r>
+          </w:p>
+          <w:p>
+            <w:pPr>
+              <w:keepLines w:val="0"/>
+              <w:spacing w:before="8" w:after="88" w:line="240" w:lineRule="auto"/>
+              <w:ind w:right="737" w:left="680"/>
+              <w:pBdr>
+                <w:bottom w:val="single" w:sz="5" w:space="0" w:color="8FA8B2"/>
+              </w:pBdr>
+            </w:pPr>
+            <w:r>
+              <w:rPr>
+                <w:rFonts w:ascii="Source Sans 3" w:hAnsi="Source Sans 3" w:eastAsia="Source Sans 3" w:cs="Source Sans 3"/>
+                <w:b w:val="0"/>
+                <w:i w:val="0"/>
+                <w:color w:val="173F4B"/>
+                <w:sz w:val="2"/>
+              </w:rPr>
+              <w:t xml:space="preserve"> </w:t>
+            </w:r>
+          </w:p>
+          <w:tbl>
+            <w:tblPr>
+              <w:tblW w:type="dxa" w:w="6690"/>
+              <w:jc w:val="left"/>
+              <w:tblLayout w:type="fixed"/>
+              <w:tblLook w:firstColumn="1" w:firstRow="1" w:lastColumn="0" w:lastRow="0" w:noHBand="0" w:noVBand="1" w:val="04A0"/>
+              <w:tblInd w:w="680" w:type="dxa"/>
+              <w:tblBorders>
+                <w:top w:val="nil"/>
+                <w:left w:val="nil"/>
+                <w:bottom w:val="nil"/>
+                <w:right w:val="nil"/>
+                <w:insideH w:val="nil"/>
+                <w:insideV w:val="nil"/>
+              </w:tblBorders>
+            </w:tblPr>
+            <w:tblGrid>
+              <w:gridCol w:w="170"/>
+              <w:gridCol w:w="6520"/>
+            </w:tblGrid>
+            <w:tr>
+              <w:trPr>
+                <w:cantSplit/>
+              </w:trPr>
+              <w:tc>
+                <w:tcPr>
+                  <w:tcW w:type="dxa" w:w="170"/>
+                  <w:vAlign w:val="top"/>
+                  <w:tcMar>
+                    <w:top w:w="0" w:type="dxa"/>
+                    <w:left w:w="0" w:type="dxa"/>
+                    <w:bottom w:w="60" w:type="dxa"/>
+                    <w:right w:w="0" w:type="dxa"/>
+                  </w:tcMar>
+                  <w:tcBorders>
+                    <w:right w:val="single" w:sz="5" w:space="0" w:color="8FA8B2"/>
+                  </w:tcBorders>
+                </w:tcPr>
+                <w:p>
+                  <w:pPr>
+                    <w:keepLines/>
+                    <w:spacing w:before="0" w:after="0" w:line="240" w:lineRule="auto"/>
+                    <w:jc w:val="right"/>
+                  </w:pPr>
+                  <w:r>
+                    <w:rPr>
+                      <w:rFonts w:ascii="Source Sans 3" w:hAnsi="Source Sans 3" w:eastAsia="Source Sans 3" w:cs="Source Sans 3"/>
+                      <w:b/>
+                      <w:i w:val="0"/>
+                      <w:color w:val="173F4B"/>
+                      <w:sz w:val="14"/>
+                    </w:rPr>
+                    <w:t>●</w:t>
+                  </w:r>
+                </w:p>
+              </w:tc>
+              <w:tc>
+                <w:tcPr>
+                  <w:tcW w:type="dxa" w:w="6520"/>
+                  <w:vAlign w:val="top"/>
+                  <w:tcMar>
+                    <w:top w:w="0" w:type="dxa"/>
+                    <w:left w:w="80" w:type="dxa"/>
+                    <w:bottom w:w="60" w:type="dxa"/>
+                    <w:right w:w="0" w:type="dxa"/>
+                  </w:tcMar>
+                </w:tcPr>
+                <w:p>
+                  <w:pPr>
+                    <w:keepNext/>
+                    <w:keepLines/>
+                    <w:tabs>
+                      <w:tab w:pos="6406" w:val="right"/>
+                    </w:tabs>
+                    <w:spacing w:before="0" w:after="22" w:line="240" w:lineRule="auto"/>
+                  </w:pPr>
+                  <w:r>
+                    <w:rPr>
+                      <w:rFonts w:ascii="Source Serif 4" w:hAnsi="Source Serif 4" w:eastAsia="Source Serif 4" w:cs="Source Serif 4"/>
+                      <w:b/>
+                      <w:i w:val="0"/>
+                      <w:color w:val="173F4B"/>
+                      <w:sz w:val="21"/>
+                    </w:rPr>
+                    <w:t>AI Engineer &amp; Product Developer</w:t>
+                  </w:r>
+                  <w:r>
+                    <w:rPr>
+                      <w:rFonts w:ascii="Source Sans 3" w:hAnsi="Source Sans 3" w:eastAsia="Source Sans 3" w:cs="Source Sans 3"/>
+                      <w:b/>
+                      <w:i w:val="0"/>
+                      <w:color w:val="173F4B"/>
+                      <w:sz w:val="15"/>
+                    </w:rPr>
+                    <w:tab/>
+                    <w:t>2024 - Present</w:t>
+                  </w:r>
+                </w:p>
+                <w:p>
+                  <w:pPr>
+                    <w:keepLines/>
+                    <w:spacing w:before="0" w:after="40" w:line="240" w:lineRule="auto"/>
+                  </w:pPr>
+                  <w:r>
+                    <w:rPr>
+                      <w:rFonts w:ascii="Source Sans 3" w:hAnsi="Source Sans 3" w:eastAsia="Source Sans 3" w:cs="Source Sans 3"/>
+                      <w:b w:val="0"/>
+                      <w:i w:val="0"/>
+                      <w:color w:val="465E67"/>
+                      <w:sz w:val="15"/>
+                    </w:rPr>
+                    <w:t>Independent projects · Antananarivo, Madagascar / Remote</w:t>
+                  </w:r>
+                </w:p>
+                <w:p>
+                  <w:pPr>
+                    <w:keepLines/>
+                    <w:spacing w:before="0" w:after="24" w:line="240" w:lineRule="auto"/>
+                    <w:ind w:left="181" w:hanging="147"/>
+                  </w:pPr>
+                  <w:r>
+                    <w:rPr>
+                      <w:rFonts w:ascii="Source Sans 3" w:hAnsi="Source Sans 3" w:eastAsia="Source Sans 3" w:cs="Source Sans 3"/>
+                      <w:b w:val="0"/>
+                      <w:i w:val="0"/>
+                      <w:color w:val="2A4650"/>
+                      <w:sz w:val="16"/>
+                    </w:rPr>
+                    <w:t>— Designed digital products combining document retrieval, assisted generation and automation, including the Akademia education platform</w:t>
+                  </w:r>
+                </w:p>
+                <w:p>
+                  <w:pPr>
+                    <w:keepLines/>
+                    <w:spacing w:before="0" w:after="24" w:line="240" w:lineRule="auto"/>
+                    <w:ind w:left="181" w:hanging="147"/>
+                  </w:pPr>
+                  <w:r>
+                    <w:rPr>
+                      <w:rFonts w:ascii="Source Sans 3" w:hAnsi="Source Sans 3" w:eastAsia="Source Sans 3" w:cs="Source Sans 3"/>
+                      <w:b w:val="0"/>
+                      <w:i w:val="0"/>
+                      <w:color w:val="2A4650"/>
+                      <w:sz w:val="16"/>
+                    </w:rPr>
+                    <w:t>— Implemented secure server-side AI integrations with traceable processing and human validation</w:t>
+                  </w:r>
+                </w:p>
+              </w:tc>
+            </w:tr>
+            <w:tr>
+              <w:trPr>
+                <w:cantSplit/>
+              </w:trPr>
+              <w:tc>
+                <w:tcPr>
+                  <w:tcW w:type="dxa" w:w="170"/>
+                  <w:vAlign w:val="top"/>
+                  <w:tcMar>
+                    <w:top w:w="0" w:type="dxa"/>
+                    <w:left w:w="0" w:type="dxa"/>
+                    <w:bottom w:w="60" w:type="dxa"/>
+                    <w:right w:w="0" w:type="dxa"/>
+                  </w:tcMar>
+                  <w:tcBorders>
+                    <w:right w:val="single" w:sz="5" w:space="0" w:color="8FA8B2"/>
+                  </w:tcBorders>
+                </w:tcPr>
+                <w:p>
+                  <w:pPr>
+                    <w:keepLines/>
+                    <w:spacing w:before="74" w:after="0" w:line="240" w:lineRule="auto"/>
+                    <w:jc w:val="right"/>
+                  </w:pPr>
+                  <w:r>
+                    <w:rPr>
+                      <w:rFonts w:ascii="Source Sans 3" w:hAnsi="Source Sans 3" w:eastAsia="Source Sans 3" w:cs="Source Sans 3"/>
+                      <w:b/>
+                      <w:i w:val="0"/>
+                      <w:color w:val="173F4B"/>
+                      <w:sz w:val="14"/>
+                    </w:rPr>
+                    <w:t>●</w:t>
+                  </w:r>
+                </w:p>
+              </w:tc>
+              <w:tc>
+                <w:tcPr>
+                  <w:tcW w:type="dxa" w:w="6520"/>
+                  <w:vAlign w:val="top"/>
+                  <w:tcMar>
+                    <w:top w:w="0" w:type="dxa"/>
+                    <w:left w:w="80" w:type="dxa"/>
+                    <w:bottom w:w="60" w:type="dxa"/>
+                    <w:right w:w="0" w:type="dxa"/>
+                  </w:tcMar>
+                </w:tcPr>
+                <w:p>
+                  <w:pPr>
+                    <w:keepNext/>
+                    <w:keepLines/>
+                    <w:tabs>
+                      <w:tab w:pos="6406" w:val="right"/>
+                    </w:tabs>
+                    <w:spacing w:before="74" w:after="22" w:line="240" w:lineRule="auto"/>
+                  </w:pPr>
+                  <w:r>
+                    <w:rPr>
+                      <w:rFonts w:ascii="Source Serif 4" w:hAnsi="Source Serif 4" w:eastAsia="Source Serif 4" w:cs="Source Serif 4"/>
+                      <w:b/>
+                      <w:i w:val="0"/>
+                      <w:color w:val="173F4B"/>
+                      <w:sz w:val="21"/>
+                    </w:rPr>
+                    <w:t>Backend PHP Developer / Fullstack</w:t>
+                  </w:r>
+                  <w:r>
+                    <w:rPr>
+                      <w:rFonts w:ascii="Source Sans 3" w:hAnsi="Source Sans 3" w:eastAsia="Source Sans 3" w:cs="Source Sans 3"/>
+                      <w:b/>
+                      <w:i w:val="0"/>
+                      <w:color w:val="173F4B"/>
+                      <w:sz w:val="15"/>
+                    </w:rPr>
+                    <w:tab/>
+                    <w:t>01/2020 - Present</w:t>
+                  </w:r>
+                </w:p>
+                <w:p>
+                  <w:pPr>
+                    <w:keepLines/>
+                    <w:spacing w:before="0" w:after="40" w:line="240" w:lineRule="auto"/>
+                  </w:pPr>
+                  <w:r>
+                    <w:rPr>
+                      <w:rFonts w:ascii="Source Sans 3" w:hAnsi="Source Sans 3" w:eastAsia="Source Sans 3" w:cs="Source Sans 3"/>
+                      <w:b w:val="0"/>
+                      <w:i w:val="0"/>
+                      <w:color w:val="465E67"/>
+                      <w:sz w:val="15"/>
+                    </w:rPr>
+                    <w:t>Fulldigits SARL · Antananarivo, Madagascar</w:t>
+                  </w:r>
+                </w:p>
+                <w:p>
+                  <w:pPr>
+                    <w:keepLines/>
+                    <w:spacing w:before="0" w:after="24" w:line="240" w:lineRule="auto"/>
+                    <w:ind w:left="181" w:hanging="147"/>
+                  </w:pPr>
+                  <w:r>
+                    <w:rPr>
+                      <w:rFonts w:ascii="Source Sans 3" w:hAnsi="Source Sans 3" w:eastAsia="Source Sans 3" w:cs="Source Sans 3"/>
+                      <w:b w:val="0"/>
+                      <w:i w:val="0"/>
+                      <w:color w:val="2A4650"/>
+                      <w:sz w:val="16"/>
+                    </w:rPr>
+                    <w:t>— Built and evolved 50+ web applications, e-commerce systems, APIs and digital services using PHP, Laravel, Symfony and WordPress</w:t>
+                  </w:r>
+                </w:p>
+                <w:p>
+                  <w:pPr>
+                    <w:keepLines/>
+                    <w:spacing w:before="0" w:after="24" w:line="240" w:lineRule="auto"/>
+                    <w:ind w:left="181" w:hanging="147"/>
+                  </w:pPr>
+                  <w:r>
+                    <w:rPr>
+                      <w:rFonts w:ascii="Source Sans 3" w:hAnsi="Source Sans 3" w:eastAsia="Source Sans 3" w:cs="Source Sans 3"/>
+                      <w:b w:val="0"/>
+                      <w:i w:val="0"/>
+                      <w:color w:val="2A4650"/>
+                      <w:sz w:val="16"/>
+                    </w:rPr>
+                    <w:t>— Handled maintenance, functional testing, REST service integration and production releases</w:t>
+                  </w:r>
+                </w:p>
+                <w:p>
+                  <w:pPr>
+                    <w:keepLines/>
+                    <w:spacing w:before="0" w:after="24" w:line="240" w:lineRule="auto"/>
+                    <w:ind w:left="181" w:hanging="147"/>
+                  </w:pPr>
+                  <w:r>
+                    <w:rPr>
+                      <w:rFonts w:ascii="Source Sans 3" w:hAnsi="Source Sans 3" w:eastAsia="Source Sans 3" w:cs="Source Sans 3"/>
+                      <w:b w:val="0"/>
+                      <w:i w:val="0"/>
+                      <w:color w:val="2A4650"/>
+                      <w:sz w:val="16"/>
+                    </w:rPr>
+                    <w:t>— Improved environment and delivery reliability with Docker and Bitbucket Pipelines</w:t>
+                  </w:r>
+                </w:p>
+                <w:p>
+                  <w:pPr>
+                    <w:keepLines/>
+                    <w:spacing w:before="10" w:after="0" w:line="240" w:lineRule="auto"/>
+                  </w:pPr>
+                  <w:r>
+                    <w:rPr>
+                      <w:rFonts w:ascii="Source Sans 3" w:hAnsi="Source Sans 3" w:eastAsia="Source Sans 3" w:cs="Source Sans 3"/>
+                      <w:b/>
+                      <w:i w:val="0"/>
+                      <w:color w:val="465E67"/>
+                      <w:sz w:val="14"/>
+                    </w:rPr>
+                    <w:t>PHP · Laravel · Symfony · MySQL · Docker · REST API</w:t>
+                  </w:r>
+                </w:p>
+              </w:tc>
+            </w:tr>
+            <w:tr>
+              <w:trPr>
+                <w:cantSplit/>
+              </w:trPr>
+              <w:tc>
+                <w:tcPr>
+                  <w:tcW w:type="dxa" w:w="170"/>
+                  <w:vAlign w:val="top"/>
+                  <w:tcMar>
+                    <w:top w:w="0" w:type="dxa"/>
+                    <w:left w:w="0" w:type="dxa"/>
+                    <w:bottom w:w="60" w:type="dxa"/>
+                    <w:right w:w="0" w:type="dxa"/>
+                  </w:tcMar>
+                  <w:tcBorders>
+                    <w:right w:val="single" w:sz="5" w:space="0" w:color="8FA8B2"/>
+                  </w:tcBorders>
+                </w:tcPr>
+                <w:p>
+                  <w:pPr>
+                    <w:keepLines/>
+                    <w:spacing w:before="74" w:after="0" w:line="240" w:lineRule="auto"/>
+                    <w:jc w:val="right"/>
+                  </w:pPr>
+                  <w:r>
+                    <w:rPr>
+                      <w:rFonts w:ascii="Source Sans 3" w:hAnsi="Source Sans 3" w:eastAsia="Source Sans 3" w:cs="Source Sans 3"/>
+                      <w:b/>
+                      <w:i w:val="0"/>
+                      <w:color w:val="173F4B"/>
+                      <w:sz w:val="14"/>
+                    </w:rPr>
+                    <w:t>●</w:t>
+                  </w:r>
+                </w:p>
+              </w:tc>
+              <w:tc>
+                <w:tcPr>
+                  <w:tcW w:type="dxa" w:w="6520"/>
+                  <w:vAlign w:val="top"/>
+                  <w:tcMar>
+                    <w:top w:w="0" w:type="dxa"/>
+                    <w:left w:w="80" w:type="dxa"/>
+                    <w:bottom w:w="60" w:type="dxa"/>
+                    <w:right w:w="0" w:type="dxa"/>
+                  </w:tcMar>
+                </w:tcPr>
+                <w:p>
+                  <w:pPr>
+                    <w:keepNext/>
+                    <w:keepLines/>
+                    <w:tabs>
+                      <w:tab w:pos="6406" w:val="right"/>
+                    </w:tabs>
+                    <w:spacing w:before="74" w:after="22" w:line="240" w:lineRule="auto"/>
+                  </w:pPr>
+                  <w:r>
+                    <w:rPr>
+                      <w:rFonts w:ascii="Source Serif 4" w:hAnsi="Source Serif 4" w:eastAsia="Source Serif 4" w:cs="Source Serif 4"/>
+                      <w:b/>
+                      <w:i w:val="0"/>
+                      <w:color w:val="173F4B"/>
+                      <w:sz w:val="21"/>
+                    </w:rPr>
+                    <w:t>Backend Node.js Developer</w:t>
+                  </w:r>
+                  <w:r>
+                    <w:rPr>
+                      <w:rFonts w:ascii="Source Sans 3" w:hAnsi="Source Sans 3" w:eastAsia="Source Sans 3" w:cs="Source Sans 3"/>
+                      <w:b/>
+                      <w:i w:val="0"/>
+                      <w:color w:val="173F4B"/>
+                      <w:sz w:val="15"/>
+                    </w:rPr>
+                    <w:tab/>
+                    <w:t>10/2019 - 01/2020</w:t>
+                  </w:r>
+                </w:p>
+                <w:p>
+                  <w:pPr>
+                    <w:keepLines/>
+                    <w:spacing w:before="0" w:after="40" w:line="240" w:lineRule="auto"/>
+                  </w:pPr>
+                  <w:r>
+                    <w:rPr>
+                      <w:rFonts w:ascii="Source Sans 3" w:hAnsi="Source Sans 3" w:eastAsia="Source Sans 3" w:cs="Source Sans 3"/>
+                      <w:b w:val="0"/>
+                      <w:i w:val="0"/>
+                      <w:color w:val="465E67"/>
+                      <w:sz w:val="15"/>
+                    </w:rPr>
+                    <w:t>Sinopsis · Antananarivo, Madagascar</w:t>
+                  </w:r>
+                </w:p>
+                <w:p>
+                  <w:pPr>
+                    <w:keepLines/>
+                    <w:spacing w:before="0" w:after="24" w:line="240" w:lineRule="auto"/>
+                    <w:ind w:left="181" w:hanging="147"/>
+                  </w:pPr>
+                  <w:r>
+                    <w:rPr>
+                      <w:rFonts w:ascii="Source Sans 3" w:hAnsi="Source Sans 3" w:eastAsia="Source Sans 3" w:cs="Source Sans 3"/>
+                      <w:b w:val="0"/>
+                      <w:i w:val="0"/>
+                      <w:color w:val="2A4650"/>
+                      <w:sz w:val="16"/>
+                    </w:rPr>
+                    <w:t>— Designed the PostgreSQL data model and implemented business rules</w:t>
+                  </w:r>
+                </w:p>
+                <w:p>
+                  <w:pPr>
+                    <w:keepLines/>
+                    <w:spacing w:before="0" w:after="24" w:line="240" w:lineRule="auto"/>
+                    <w:ind w:left="181" w:hanging="147"/>
+                  </w:pPr>
+                  <w:r>
+                    <w:rPr>
+                      <w:rFonts w:ascii="Source Sans 3" w:hAnsi="Source Sans 3" w:eastAsia="Source Sans 3" w:cs="Source Sans 3"/>
+                      <w:b w:val="0"/>
+                      <w:i w:val="0"/>
+                      <w:color w:val="2A4650"/>
+                      <w:sz w:val="16"/>
+                    </w:rPr>
+                    <w:t>— Built backend services with Node.js, Express and Java Spring Boot</w:t>
+                  </w:r>
+                </w:p>
+                <w:p>
+                  <w:pPr>
+                    <w:keepLines/>
+                    <w:spacing w:before="10" w:after="0" w:line="240" w:lineRule="auto"/>
+                  </w:pPr>
+                  <w:r>
+                    <w:rPr>
+                      <w:rFonts w:ascii="Source Sans 3" w:hAnsi="Source Sans 3" w:eastAsia="Source Sans 3" w:cs="Source Sans 3"/>
+                      <w:b/>
+                      <w:i w:val="0"/>
+                      <w:color w:val="465E67"/>
+                      <w:sz w:val="14"/>
+                    </w:rPr>
+                    <w:t>Node.js · Java · PostgreSQL · REST API</w:t>
+                  </w:r>
+                </w:p>
+              </w:tc>
+            </w:tr>
+          </w:tbl>
+          <w:p>
+            <w:pPr>
+              <w:spacing w:before="0" w:after="0" w:line="240" w:lineRule="auto"/>
+              <w:ind w:left="680" w:right="737"/>
+            </w:pPr>
+            <w:r>
+              <w:rPr>
+                <w:rFonts w:ascii="Source Sans 3" w:hAnsi="Source Sans 3" w:eastAsia="Source Sans 3" w:cs="Source Sans 3"/>
+                <w:b w:val="0"/>
+                <w:i w:val="0"/>
+                <w:color w:val="465E67"/>
+                <w:sz w:val="2"/>
+              </w:rPr>
+              <w:t xml:space="preserve"> </w:t>
+            </w:r>
+          </w:p>
+          <w:p>
+            <w:pPr>
+              <w:keepNext/>
+              <w:keepLines/>
+              <w:spacing w:before="110" w:after="0" w:line="240" w:lineRule="auto"/>
+              <w:ind w:left="680" w:right="737"/>
+            </w:pPr>
+            <w:r>
+              <w:drawing>
+                <wp:inline xmlns:a="http://schemas.openxmlformats.org/drawingml/2006/main" xmlns:pic="http://schemas.openxmlformats.org/drawingml/2006/picture">
+                  <wp:extent cx="104400" cy="104400"/>
+                  <wp:docPr id="7" name="Picture 7"/>
+                  <wp:cNvGraphicFramePr>
+                    <a:graphicFrameLocks noChangeAspect="1"/>
+                  </wp:cNvGraphicFramePr>
+                  <a:graphic>
+                    <a:graphicData uri="http://schemas.openxmlformats.org/drawingml/2006/picture">
+                      <pic:pic>
+                        <pic:nvPicPr>
+                          <pic:cNvPr id="0" name="projects.png"/>
+                          <pic:cNvPicPr/>
+                        </pic:nvPicPr>
+                        <pic:blipFill>
+                          <a:blip r:embed="rId20"/>
+                          <a:stretch>
+                            <a:fillRect/>
+                          </a:stretch>
+                        </pic:blipFill>
+                        <pic:spPr>
+                          <a:xfrm>
+                            <a:off x="0" y="0"/>
+                            <a:ext cx="104400" cy="104400"/>
+                          </a:xfrm>
+                          <a:prstGeom prst="rect"/>
+                        </pic:spPr>
+                      </pic:pic>
+                    </a:graphicData>
+                  </a:graphic>
+                </wp:inline>
+              </w:drawing>
+            </w:r>
+            <w:r>
+              <w:rPr>
+                <w:rFonts w:ascii="Source Sans 3" w:hAnsi="Source Sans 3" w:eastAsia="Source Sans 3" w:cs="Source Sans 3"/>
+                <w:b w:val="0"/>
+                <w:i w:val="0"/>
+                <w:color w:val="173F4B"/>
+                <w:sz w:val="4"/>
+              </w:rPr>
+              <w:t xml:space="preserve">  </w:t>
+            </w:r>
+            <w:r>
+              <w:rPr>
+                <w:rFonts w:ascii="Source Sans 3" w:hAnsi="Source Sans 3" w:eastAsia="Source Sans 3" w:cs="Source Sans 3"/>
+                <w:b/>
+                <w:i w:val="0"/>
+                <w:color w:val="173F4B"/>
+                <w:sz w:val="17"/>
+                <w:spacing w:val="18"/>
+              </w:rPr>
+              <w:t>SELECTED WORK</w:t>
+            </w:r>
+          </w:p>
+          <w:p>
+            <w:pPr>
+              <w:keepLines w:val="0"/>
+              <w:spacing w:before="8" w:after="76" w:line="240" w:lineRule="auto"/>
+              <w:ind w:right="737" w:left="680"/>
+              <w:pBdr>
+                <w:bottom w:val="single" w:sz="5" w:space="0" w:color="8FA8B2"/>
+              </w:pBdr>
+            </w:pPr>
+            <w:r>
+              <w:rPr>
+                <w:rFonts w:ascii="Source Sans 3" w:hAnsi="Source Sans 3" w:eastAsia="Source Sans 3" w:cs="Source Sans 3"/>
+                <w:b w:val="0"/>
+                <w:i w:val="0"/>
+                <w:color w:val="173F4B"/>
+                <w:sz w:val="2"/>
+              </w:rPr>
+              <w:t xml:space="preserve"> </w:t>
+            </w:r>
+          </w:p>
+          <w:tbl>
+            <w:tblPr>
+              <w:tblW w:type="dxa" w:w="6690"/>
+              <w:jc w:val="left"/>
+              <w:tblLayout w:type="fixed"/>
+              <w:tblLook w:firstColumn="1" w:firstRow="1" w:lastColumn="0" w:lastRow="0" w:noHBand="0" w:noVBand="1" w:val="04A0"/>
+              <w:tblInd w:w="680" w:type="dxa"/>
+              <w:tblBorders>
+                <w:top w:val="nil"/>
+                <w:left w:val="nil"/>
+                <w:bottom w:val="nil"/>
+                <w:right w:val="nil"/>
+                <w:insideH w:val="nil"/>
+                <w:insideV w:val="nil"/>
+              </w:tblBorders>
+            </w:tblPr>
+            <w:tblGrid>
+              <w:gridCol w:w="3175"/>
+              <w:gridCol w:w="340"/>
+              <w:gridCol w:w="3175"/>
+            </w:tblGrid>
+            <w:tr>
+              <w:tc>
+                <w:tcPr>
+                  <w:tcW w:type="dxa" w:w="3175"/>
+                  <w:tcMar>
+                    <w:top w:w="65" w:type="dxa"/>
+                    <w:left w:w="0" w:type="dxa"/>
+                    <w:bottom w:w="0" w:type="dxa"/>
+                    <w:right w:w="0" w:type="dxa"/>
+                  </w:tcMar>
+                  <w:vAlign w:val="top"/>
+                </w:tcPr>
+                <w:p>
+                  <w:pPr>
+                    <w:keepLines/>
+                    <w:spacing w:before="0" w:after="20" w:line="240" w:lineRule="auto"/>
+                  </w:pPr>
+                  <w:r>
+                    <w:rPr>
+                      <w:rFonts w:ascii="Source Sans 3" w:hAnsi="Source Sans 3" w:eastAsia="Source Sans 3" w:cs="Source Sans 3"/>
+                      <w:b/>
+                      <w:i w:val="0"/>
+                      <w:color w:val="173F4B"/>
+                      <w:sz w:val="13"/>
+                      <w:spacing w:val="8"/>
+                    </w:rPr>
+                    <w:t>EDUCATION PLATFORM + RAG</w:t>
+                  </w:r>
+                </w:p>
+                <w:tbl>
+                  <w:tblPr>
+                    <w:tblW w:type="dxa" w:w="3175"/>
+                    <w:jc w:val="left"/>
+                    <w:tblLayout w:type="fixed"/>
+                    <w:tblLook w:firstColumn="1" w:firstRow="1" w:lastColumn="0" w:lastRow="0" w:noHBand="0" w:noVBand="1" w:val="04A0"/>
+                    <w:tblBorders>
+                      <w:top w:val="nil"/>
+                      <w:left w:val="nil"/>
+                      <w:bottom w:val="nil"/>
+                      <w:right w:val="nil"/>
+                      <w:insideH w:val="nil"/>
+                      <w:insideV w:val="nil"/>
+                    </w:tblBorders>
+                  </w:tblPr>
+                  <w:tblGrid>
+                    <w:gridCol w:w="2438"/>
+                    <w:gridCol w:w="737"/>
+                  </w:tblGrid>
+                  <w:tr>
+                    <w:tc>
+                      <w:tcPr>
+                        <w:tcW w:type="dxa" w:w="2438"/>
+                        <w:tcMar>
+                          <w:top w:w="0" w:type="dxa"/>
+                          <w:left w:w="0" w:type="dxa"/>
+                          <w:bottom w:w="0" w:type="dxa"/>
+                          <w:right w:w="0" w:type="dxa"/>
+                        </w:tcMar>
+                      </w:tcPr>
+                      <w:p>
+                        <w:pPr>
+                          <w:keepLines/>
+                          <w:spacing w:before="0" w:after="0" w:line="240" w:lineRule="auto"/>
+                        </w:pPr>
+                        <w:r>
+                          <w:rPr>
+                            <w:rFonts w:ascii="Source Serif 4" w:hAnsi="Source Serif 4" w:eastAsia="Source Serif 4" w:cs="Source Serif 4"/>
+                            <w:b/>
+                            <w:i w:val="0"/>
+                            <w:color w:val="173F4B"/>
+                            <w:sz w:val="18"/>
+                          </w:rPr>
+                          <w:t>Akademia</w:t>
+                        </w:r>
+                      </w:p>
+                    </w:tc>
+                    <w:tc>
+                      <w:tcPr>
+                        <w:tcW w:type="dxa" w:w="737"/>
+                        <w:tcMar>
+                          <w:top w:w="0" w:type="dxa"/>
+                          <w:left w:w="0" w:type="dxa"/>
+                          <w:bottom w:w="0" w:type="dxa"/>
+                          <w:right w:w="0" w:type="dxa"/>
+                        </w:tcMar>
+                      </w:tcPr>
+                      <w:p>
+                        <w:pPr>
+                          <w:keepLines w:val="0"/>
+                          <w:spacing w:before="0" w:after="0" w:line="240" w:lineRule="auto"/>
+                          <w:jc w:val="right"/>
+                        </w:pPr>
+                        <w:r>
+                          <w:rPr>
+                            <w:rFonts w:ascii="Source Sans 3" w:hAnsi="Source Sans 3" w:eastAsia="Source Sans 3" w:cs="Source Sans 3"/>
+                            <w:b w:val="0"/>
+                            <w:i w:val="0"/>
+                            <w:color w:val="465E67"/>
+                            <w:sz w:val="13"/>
+                          </w:rPr>
+                          <w:t>2024-2026</w:t>
+                        </w:r>
+                      </w:p>
+                    </w:tc>
+                  </w:tr>
+                </w:tbl>
+                <w:p>
+                  <w:pPr>
+                    <w:spacing w:before="0" w:after="0" w:line="240" w:lineRule="auto"/>
+                  </w:pPr>
+                  <w:r>
+                    <w:rPr>
+                      <w:rFonts w:ascii="Source Sans 3" w:hAnsi="Source Sans 3" w:eastAsia="Source Sans 3" w:cs="Source Sans 3"/>
+                      <w:b w:val="0"/>
+                      <w:i w:val="0"/>
+                      <w:color w:val="465E67"/>
+                      <w:sz w:val="2"/>
+                    </w:rPr>
+                    <w:t xml:space="preserve"> </w:t>
+                  </w:r>
+                </w:p>
+                <w:p>
+                  <w:pPr>
+                    <w:keepLines/>
+                    <w:spacing w:before="0" w:after="24" w:line="240" w:lineRule="auto"/>
+                  </w:pPr>
+                  <w:r>
+                    <w:rPr>
+                      <w:rFonts w:ascii="Source Sans 3" w:hAnsi="Source Sans 3" w:eastAsia="Source Sans 3" w:cs="Source Sans 3"/>
+                      <w:b w:val="0"/>
+                      <w:i w:val="0"/>
+                      <w:color w:val="2A4650"/>
+                      <w:sz w:val="14"/>
+                    </w:rPr>
+                    <w:t>Multi-tenant education platform with RAG-powered assistance for schools and learners.</w:t>
+                  </w:r>
+                </w:p>
+                <w:p>
+                  <w:pPr>
+                    <w:keepLines/>
+                    <w:spacing w:before="0" w:after="0" w:line="240" w:lineRule="auto"/>
+                  </w:pPr>
+                  <w:r>
+                    <w:rPr>
+                      <w:rFonts w:ascii="Source Sans 3" w:hAnsi="Source Sans 3" w:eastAsia="Source Sans 3" w:cs="Source Sans 3"/>
+                      <w:b w:val="0"/>
+                      <w:i w:val="0"/>
+                      <w:color w:val="465E67"/>
+                      <w:sz w:val="14"/>
+                    </w:rPr>
+                    <w:t>Unified architecture for BEPC, BACC and competitive exam pathways</w:t>
+                  </w:r>
+                </w:p>
+              </w:tc>
+              <w:tc>
+                <w:tcPr>
+                  <w:tcW w:type="dxa" w:w="340"/>
+                  <w:tcMar>
+                    <w:top w:w="65" w:type="dxa"/>
+                    <w:left w:w="0" w:type="dxa"/>
+                    <w:bottom w:w="0" w:type="dxa"/>
+                    <w:right w:w="0" w:type="dxa"/>
+                  </w:tcMar>
+                  <w:vAlign w:val="top"/>
+                </w:tcPr>
+                <w:p>
+                  <w:pPr>
+                    <w:keepLines w:val="0"/>
+                    <w:spacing w:before="0" w:after="0" w:line="240" w:lineRule="auto"/>
+                  </w:pPr>
+                </w:p>
+              </w:tc>
+              <w:tc>
+                <w:tcPr>
+                  <w:tcW w:type="dxa" w:w="3175"/>
+                  <w:tcMar>
+                    <w:top w:w="65" w:type="dxa"/>
+                    <w:left w:w="0" w:type="dxa"/>
+                    <w:bottom w:w="0" w:type="dxa"/>
+                    <w:right w:w="0" w:type="dxa"/>
+                  </w:tcMar>
+                  <w:vAlign w:val="top"/>
+                </w:tcPr>
+                <w:p>
+                  <w:pPr>
+                    <w:keepLines/>
+                    <w:spacing w:before="0" w:after="20" w:line="240" w:lineRule="auto"/>
+                  </w:pPr>
+                  <w:r>
+                    <w:rPr>
+                      <w:rFonts w:ascii="Source Sans 3" w:hAnsi="Source Sans 3" w:eastAsia="Source Sans 3" w:cs="Source Sans 3"/>
+                      <w:b/>
+                      <w:i w:val="0"/>
+                      <w:color w:val="173F4B"/>
+                      <w:sz w:val="13"/>
+                      <w:spacing w:val="8"/>
+                    </w:rPr>
+                    <w:t>FREELANCE PROJECT</w:t>
+                  </w:r>
+                </w:p>
+                <w:tbl>
+                  <w:tblPr>
+                    <w:tblW w:type="dxa" w:w="3175"/>
+                    <w:jc w:val="left"/>
+                    <w:tblLayout w:type="fixed"/>
+                    <w:tblLook w:firstColumn="1" w:firstRow="1" w:lastColumn="0" w:lastRow="0" w:noHBand="0" w:noVBand="1" w:val="04A0"/>
+                    <w:tblBorders>
+                      <w:top w:val="nil"/>
+                      <w:left w:val="nil"/>
+                      <w:bottom w:val="nil"/>
+                      <w:right w:val="nil"/>
+                      <w:insideH w:val="nil"/>
+                      <w:insideV w:val="nil"/>
+                    </w:tblBorders>
+                  </w:tblPr>
+                  <w:tblGrid>
+                    <w:gridCol w:w="2438"/>
+                    <w:gridCol w:w="737"/>
+                  </w:tblGrid>
+                  <w:tr>
+                    <w:tc>
+                      <w:tcPr>
+                        <w:tcW w:type="dxa" w:w="2438"/>
+                        <w:tcMar>
+                          <w:top w:w="0" w:type="dxa"/>
+                          <w:left w:w="0" w:type="dxa"/>
+                          <w:bottom w:w="0" w:type="dxa"/>
+                          <w:right w:w="0" w:type="dxa"/>
+                        </w:tcMar>
+                      </w:tcPr>
+                      <w:p>
+                        <w:pPr>
+                          <w:keepLines/>
+                          <w:spacing w:before="0" w:after="0" w:line="240" w:lineRule="auto"/>
+                        </w:pPr>
+                        <w:r>
+                          <w:rPr>
+                            <w:rFonts w:ascii="Source Serif 4" w:hAnsi="Source Serif 4" w:eastAsia="Source Serif 4" w:cs="Source Serif 4"/>
+                            <w:b/>
+                            <w:i w:val="0"/>
+                            <w:color w:val="173F4B"/>
+                            <w:sz w:val="18"/>
+                          </w:rPr>
+                          <w:t>Madagascar University Fair (FUM)</w:t>
+                        </w:r>
+                      </w:p>
+                    </w:tc>
+                    <w:tc>
+                      <w:tcPr>
+                        <w:tcW w:type="dxa" w:w="737"/>
+                        <w:tcMar>
+                          <w:top w:w="0" w:type="dxa"/>
+                          <w:left w:w="0" w:type="dxa"/>
+                          <w:bottom w:w="0" w:type="dxa"/>
+                          <w:right w:w="0" w:type="dxa"/>
+                        </w:tcMar>
+                      </w:tcPr>
+                      <w:p>
+                        <w:pPr>
+                          <w:keepLines w:val="0"/>
+                          <w:spacing w:before="0" w:after="0" w:line="240" w:lineRule="auto"/>
+                          <w:jc w:val="right"/>
+                        </w:pPr>
+                        <w:r>
+                          <w:rPr>
+                            <w:rFonts w:ascii="Source Sans 3" w:hAnsi="Source Sans 3" w:eastAsia="Source Sans 3" w:cs="Source Sans 3"/>
+                            <w:b w:val="0"/>
+                            <w:i w:val="0"/>
+                            <w:color w:val="465E67"/>
+                            <w:sz w:val="13"/>
+                          </w:rPr>
+                          <w:t>07/2026</w:t>
+                        </w:r>
+                      </w:p>
+                    </w:tc>
+                  </w:tr>
+                </w:tbl>
+                <w:p>
+                  <w:pPr>
+                    <w:spacing w:before="0" w:after="0" w:line="240" w:lineRule="auto"/>
+                  </w:pPr>
+                  <w:r>
+                    <w:rPr>
+                      <w:rFonts w:ascii="Source Sans 3" w:hAnsi="Source Sans 3" w:eastAsia="Source Sans 3" w:cs="Source Sans 3"/>
+                      <w:b w:val="0"/>
+                      <w:i w:val="0"/>
+                      <w:color w:val="465E67"/>
+                      <w:sz w:val="2"/>
+                    </w:rPr>
+                    <w:t xml:space="preserve"> </w:t>
+                  </w:r>
+                </w:p>
+                <w:p>
+                  <w:pPr>
+                    <w:keepLines/>
+                    <w:spacing w:before="0" w:after="24" w:line="240" w:lineRule="auto"/>
+                  </w:pPr>
+                  <w:r>
+                    <w:rPr>
+                      <w:rFonts w:ascii="Source Sans 3" w:hAnsi="Source Sans 3" w:eastAsia="Source Sans 3" w:cs="Source Sans 3"/>
+                      <w:b w:val="0"/>
+                      <w:i w:val="0"/>
+                      <w:color w:val="2A4650"/>
+                      <w:sz w:val="14"/>
+                    </w:rPr>
+                    <w:t>Event website for Prime Vision with institute search, filterable gallery and exhibitor registration.</w:t>
+                  </w:r>
+                </w:p>
+                <w:p>
+                  <w:pPr>
+                    <w:keepLines/>
+                    <w:spacing w:before="0" w:after="0" w:line="240" w:lineRule="auto"/>
+                  </w:pPr>
+                  <w:r>
+                    <w:rPr>
+                      <w:rFonts w:ascii="Source Sans 3" w:hAnsi="Source Sans 3" w:eastAsia="Source Sans 3" w:cs="Source Sans 3"/>
+                      <w:b w:val="0"/>
+                      <w:i w:val="0"/>
+                      <w:color w:val="465E67"/>
+                      <w:sz w:val="14"/>
+                    </w:rPr>
+                    <w:t>Centralised registration and document distribution workflow</w:t>
+                  </w:r>
+                </w:p>
+              </w:tc>
+            </w:tr>
+          </w:tbl>
+          <w:p>
+            <w:pPr>
+              <w:spacing w:before="0" w:after="0" w:line="240" w:lineRule="auto"/>
+              <w:ind w:left="680" w:right="737"/>
+            </w:pPr>
+            <w:r>
+              <w:rPr>
+                <w:rFonts w:ascii="Source Sans 3" w:hAnsi="Source Sans 3" w:eastAsia="Source Sans 3" w:cs="Source Sans 3"/>
+                <w:b w:val="0"/>
+                <w:i w:val="0"/>
+                <w:color w:val="465E67"/>
+                <w:sz w:val="2"/>
+              </w:rPr>
+              <w:t xml:space="preserve"> </w:t>
+            </w:r>
+          </w:p>
+          <w:tbl>
+            <w:tblPr>
+              <w:tblW w:type="dxa" w:w="6690"/>
+              <w:jc w:val="left"/>
+              <w:tblLayout w:type="fixed"/>
+              <w:tblLook w:firstColumn="1" w:firstRow="1" w:lastColumn="0" w:lastRow="0" w:noHBand="0" w:noVBand="1" w:val="04A0"/>
+              <w:tblInd w:w="680" w:type="dxa"/>
+              <w:tblBorders>
+                <w:top w:val="nil"/>
+                <w:left w:val="nil"/>
+                <w:bottom w:val="nil"/>
+                <w:right w:val="nil"/>
+                <w:insideH w:val="nil"/>
+                <w:insideV w:val="nil"/>
+              </w:tblBorders>
+            </w:tblPr>
+            <w:tblGrid>
+              <w:gridCol w:w="3175"/>
+              <w:gridCol w:w="340"/>
+              <w:gridCol w:w="3175"/>
+            </w:tblGrid>
+            <w:tr>
+              <w:tc>
+                <w:tcPr>
+                  <w:tcW w:type="dxa" w:w="3175"/>
+                  <w:tcMar>
+                    <w:top w:w="85" w:type="dxa"/>
+                    <w:left w:w="0" w:type="dxa"/>
+                    <w:bottom w:w="0" w:type="dxa"/>
+                    <w:right w:w="0" w:type="dxa"/>
+                  </w:tcMar>
+                  <w:vAlign w:val="top"/>
+                </w:tcPr>
+                <w:p>
+                  <w:pPr>
+                    <w:keepNext/>
+                    <w:keepLines/>
+                    <w:spacing w:before="0" w:after="0" w:line="240" w:lineRule="auto"/>
+                  </w:pPr>
+                  <w:r>
+                    <w:drawing>
+                      <wp:inline xmlns:a="http://schemas.openxmlformats.org/drawingml/2006/main" xmlns:pic="http://schemas.openxmlformats.org/drawingml/2006/picture">
+                        <wp:extent cx="93600" cy="93600"/>
+                        <wp:docPr id="8" name="Picture 8"/>
+                        <wp:cNvGraphicFramePr>
+                          <a:graphicFrameLocks noChangeAspect="1"/>
+                        </wp:cNvGraphicFramePr>
+                        <a:graphic>
+                          <a:graphicData uri="http://schemas.openxmlformats.org/drawingml/2006/picture">
+                            <pic:pic>
+                              <pic:nvPicPr>
+                                <pic:cNvPr id="0" name="education.png"/>
+                                <pic:cNvPicPr/>
+                              </pic:nvPicPr>
+                              <pic:blipFill>
+                                <a:blip r:embed="rId21"/>
+                                <a:stretch>
+                                  <a:fillRect/>
+                                </a:stretch>
+                              </pic:blipFill>
+                              <pic:spPr>
+                                <a:xfrm>
+                                  <a:off x="0" y="0"/>
+                                  <a:ext cx="93600" cy="93600"/>
+                                </a:xfrm>
+                                <a:prstGeom prst="rect"/>
+                              </pic:spPr>
+                            </pic:pic>
+                          </a:graphicData>
+                        </a:graphic>
+                      </wp:inline>
+                    </w:drawing>
+                  </w:r>
+                  <w:r>
+                    <w:rPr>
+                      <w:rFonts w:ascii="Source Sans 3" w:hAnsi="Source Sans 3" w:eastAsia="Source Sans 3" w:cs="Source Sans 3"/>
+                      <w:b w:val="0"/>
+                      <w:i w:val="0"/>
+                      <w:color w:val="173F4B"/>
+                      <w:sz w:val="4"/>
+                    </w:rPr>
+                    <w:t xml:space="preserve">  </w:t>
+                  </w:r>
+                  <w:r>
+                    <w:rPr>
+                      <w:rFonts w:ascii="Source Sans 3" w:hAnsi="Source Sans 3" w:eastAsia="Source Sans 3" w:cs="Source Sans 3"/>
+                      <w:b/>
+                      <w:i w:val="0"/>
+                      <w:color w:val="173F4B"/>
+                      <w:sz w:val="15"/>
+                      <w:spacing w:val="18"/>
+                    </w:rPr>
+                    <w:t>EDUCATION</w:t>
+                  </w:r>
+                </w:p>
+                <w:p>
+                  <w:pPr>
+                    <w:keepLines w:val="0"/>
+                    <w:spacing w:before="8" w:after="60" w:line="240" w:lineRule="auto"/>
+                    <w:ind w:right="0"/>
+                    <w:pBdr>
+                      <w:bottom w:val="single" w:sz="5" w:space="0" w:color="8FA8B2"/>
+                    </w:pBdr>
+                  </w:pPr>
+                  <w:r>
+                    <w:rPr>
+                      <w:rFonts w:ascii="Source Sans 3" w:hAnsi="Source Sans 3" w:eastAsia="Source Sans 3" w:cs="Source Sans 3"/>
+                      <w:b w:val="0"/>
+                      <w:i w:val="0"/>
+                      <w:color w:val="173F4B"/>
+                      <w:sz w:val="2"/>
+                    </w:rPr>
+                    <w:t xml:space="preserve"> </w:t>
+                  </w:r>
+                </w:p>
+                <w:p>
+                  <w:pPr>
+                    <w:keepLines/>
+                    <w:spacing w:before="0" w:after="24" w:line="240" w:lineRule="auto"/>
+                  </w:pPr>
+                  <w:r>
+                    <w:rPr>
+                      <w:rFonts w:ascii="Source Serif 4" w:hAnsi="Source Serif 4" w:eastAsia="Source Serif 4" w:cs="Source Serif 4"/>
+                      <w:b/>
+                      <w:i w:val="0"/>
+                      <w:color w:val="173F4B"/>
+                      <w:sz w:val="18"/>
+                    </w:rPr>
+                    <w:t>Bachelor's Degree in Software Development</w:t>
+                  </w:r>
+                </w:p>
+                <w:p>
+                  <w:pPr>
+                    <w:keepLines/>
+                    <w:spacing w:before="0" w:after="12" w:line="240" w:lineRule="auto"/>
+                  </w:pPr>
+                  <w:r>
+                    <w:rPr>
+                      <w:rFonts w:ascii="Source Sans 3" w:hAnsi="Source Sans 3" w:eastAsia="Source Sans 3" w:cs="Source Sans 3"/>
+                      <w:b w:val="0"/>
+                      <w:i w:val="0"/>
+                      <w:color w:val="465E67"/>
+                      <w:sz w:val="14"/>
+                    </w:rPr>
+                    <w:t>IT University</w:t>
+                  </w:r>
+                </w:p>
+                <w:p>
+                  <w:pPr>
+                    <w:keepLines/>
+                    <w:spacing w:before="0" w:after="0" w:line="240" w:lineRule="auto"/>
+                  </w:pPr>
+                  <w:r>
+                    <w:rPr>
+                      <w:rFonts w:ascii="Source Sans 3" w:hAnsi="Source Sans 3" w:eastAsia="Source Sans 3" w:cs="Source Sans 3"/>
+                      <w:b w:val="0"/>
+                      <w:i w:val="0"/>
+                      <w:color w:val="465E67"/>
+                      <w:sz w:val="14"/>
+                    </w:rPr>
+                    <w:t>09/2015 - 12/2018</w:t>
+                  </w:r>
+                </w:p>
+              </w:tc>
+              <w:tc>
+                <w:tcPr>
+                  <w:tcW w:type="dxa" w:w="340"/>
+                  <w:tcMar>
+                    <w:top w:w="85" w:type="dxa"/>
+                    <w:left w:w="0" w:type="dxa"/>
+                    <w:bottom w:w="0" w:type="dxa"/>
+                    <w:right w:w="0" w:type="dxa"/>
+                  </w:tcMar>
+                  <w:vAlign w:val="top"/>
+                </w:tcPr>
+                <w:p>
+                  <w:pPr>
+                    <w:keepLines w:val="0"/>
+                    <w:spacing w:before="0" w:after="0" w:line="240" w:lineRule="auto"/>
+                  </w:pPr>
+                </w:p>
+              </w:tc>
+              <w:tc>
+                <w:tcPr>
+                  <w:tcW w:type="dxa" w:w="3175"/>
+                  <w:tcMar>
+                    <w:top w:w="85" w:type="dxa"/>
+                    <w:left w:w="0" w:type="dxa"/>
+                    <w:bottom w:w="0" w:type="dxa"/>
+                    <w:right w:w="0" w:type="dxa"/>
+                  </w:tcMar>
+                  <w:vAlign w:val="top"/>
+                </w:tcPr>
+                <w:p>
+                  <w:pPr>
+                    <w:keepNext/>
+                    <w:keepLines/>
+                    <w:spacing w:before="0" w:after="0" w:line="240" w:lineRule="auto"/>
+                  </w:pPr>
+                  <w:r>
+                    <w:drawing>
+                      <wp:inline xmlns:a="http://schemas.openxmlformats.org/drawingml/2006/main" xmlns:pic="http://schemas.openxmlformats.org/drawingml/2006/picture">
+                        <wp:extent cx="93600" cy="93600"/>
+                        <wp:docPr id="9" name="Picture 9"/>
+                        <wp:cNvGraphicFramePr>
+                          <a:graphicFrameLocks noChangeAspect="1"/>
+                        </wp:cNvGraphicFramePr>
+                        <a:graphic>
+                          <a:graphicData uri="http://schemas.openxmlformats.org/drawingml/2006/picture">
+                            <pic:pic>
+                              <pic:nvPicPr>
+                                <pic:cNvPr id="0" name="certifications.png"/>
+                                <pic:cNvPicPr/>
+                              </pic:nvPicPr>
+                              <pic:blipFill>
+                                <a:blip r:embed="rId22"/>
+                                <a:stretch>
+                                  <a:fillRect/>
+                                </a:stretch>
+                              </pic:blipFill>
+                              <pic:spPr>
+                                <a:xfrm>
+                                  <a:off x="0" y="0"/>
+                                  <a:ext cx="93600" cy="93600"/>
+                                </a:xfrm>
+                                <a:prstGeom prst="rect"/>
+                              </pic:spPr>
+                            </pic:pic>
+                          </a:graphicData>
+                        </a:graphic>
+                      </wp:inline>
+                    </w:drawing>
+                  </w:r>
+                  <w:r>
+                    <w:rPr>
+                      <w:rFonts w:ascii="Source Sans 3" w:hAnsi="Source Sans 3" w:eastAsia="Source Sans 3" w:cs="Source Sans 3"/>
+                      <w:b w:val="0"/>
+                      <w:i w:val="0"/>
+                      <w:color w:val="173F4B"/>
+                      <w:sz w:val="4"/>
+                    </w:rPr>
+                    <w:t xml:space="preserve">  </w:t>
+                  </w:r>
+                  <w:r>
+                    <w:rPr>
+                      <w:rFonts w:ascii="Source Sans 3" w:hAnsi="Source Sans 3" w:eastAsia="Source Sans 3" w:cs="Source Sans 3"/>
+                      <w:b/>
+                      <w:i w:val="0"/>
+                      <w:color w:val="173F4B"/>
+                      <w:sz w:val="15"/>
+                      <w:spacing w:val="18"/>
+                    </w:rPr>
+                    <w:t>CERTIFICATIONS</w:t>
+                  </w:r>
+                </w:p>
+                <w:p>
+                  <w:pPr>
+                    <w:keepLines w:val="0"/>
+                    <w:spacing w:before="8" w:after="60" w:line="240" w:lineRule="auto"/>
+                    <w:ind w:right="0"/>
+                    <w:pBdr>
+                      <w:bottom w:val="single" w:sz="5" w:space="0" w:color="8FA8B2"/>
+                    </w:pBdr>
+                  </w:pPr>
+                  <w:r>
+                    <w:rPr>
+                      <w:rFonts w:ascii="Source Sans 3" w:hAnsi="Source Sans 3" w:eastAsia="Source Sans 3" w:cs="Source Sans 3"/>
+                      <w:b w:val="0"/>
+                      <w:i w:val="0"/>
+                      <w:color w:val="173F4B"/>
+                      <w:sz w:val="2"/>
+                    </w:rPr>
+                    <w:t xml:space="preserve"> </w:t>
+                  </w:r>
+                </w:p>
+                <w:p>
+                  <w:pPr>
+                    <w:keepLines/>
+                    <w:spacing w:before="0" w:after="14" w:line="240" w:lineRule="auto"/>
+                  </w:pPr>
+                  <w:r>
+                    <w:rPr>
+                      <w:rFonts w:ascii="Source Sans 3" w:hAnsi="Source Sans 3" w:eastAsia="Source Sans 3" w:cs="Source Sans 3"/>
+                      <w:b/>
+                      <w:i w:val="0"/>
+                      <w:color w:val="173F4B"/>
+                      <w:sz w:val="14"/>
+                    </w:rPr>
+                    <w:t>DELF B2 - French Language Diploma</w:t>
+                  </w:r>
+                  <w:r>
+                    <w:rPr>
+                      <w:rFonts w:ascii="Source Sans 3" w:hAnsi="Source Sans 3" w:eastAsia="Source Sans 3" w:cs="Source Sans 3"/>
+                      <w:b w:val="0"/>
+                      <w:i w:val="0"/>
+                      <w:color w:val="465E67"/>
+                      <w:sz w:val="14"/>
+                    </w:rPr>
+                    <w:t xml:space="preserve"> — Alliance Française Antananarivo</w:t>
+                  </w:r>
+                </w:p>
+              </w:tc>
+            </w:tr>
+          </w:tbl>
+          <w:p>
+            <w:pPr>
+              <w:spacing w:before="0" w:after="0" w:line="240" w:lineRule="auto"/>
+              <w:ind w:left="680" w:right="737"/>
+            </w:pPr>
+            <w:r>
+              <w:rPr>
+                <w:rFonts w:ascii="Source Sans 3" w:hAnsi="Source Sans 3" w:eastAsia="Source Sans 3" w:cs="Source Sans 3"/>
+                <w:b w:val="0"/>
+                <w:i w:val="0"/>
+                <w:color w:val="465E67"/>
+                <w:sz w:val="2"/>
+              </w:rPr>
+              <w:t xml:space="preserve"> </w:t>
+            </w:r>
+          </w:p>
+          <w:p>
+            <w:pPr>
+              <w:keepNext/>
+              <w:keepLines/>
+              <w:spacing w:before="92" w:after="0" w:line="240" w:lineRule="auto"/>
+              <w:ind w:left="680" w:right="737"/>
+            </w:pPr>
+            <w:r>
+              <w:drawing>
+                <wp:inline xmlns:a="http://schemas.openxmlformats.org/drawingml/2006/main" xmlns:pic="http://schemas.openxmlformats.org/drawingml/2006/picture">
+                  <wp:extent cx="93600" cy="93600"/>
+                  <wp:docPr id="10" name="Picture 10"/>
+                  <wp:cNvGraphicFramePr>
+                    <a:graphicFrameLocks noChangeAspect="1"/>
+                  </wp:cNvGraphicFramePr>
+                  <a:graphic>
+                    <a:graphicData uri="http://schemas.openxmlformats.org/drawingml/2006/picture">
+                      <pic:pic>
+                        <pic:nvPicPr>
+                          <pic:cNvPr id="0" name="interests.png"/>
+                          <pic:cNvPicPr/>
+                        </pic:nvPicPr>
+                        <pic:blipFill>
+                          <a:blip r:embed="rId23"/>
+                          <a:stretch>
+                            <a:fillRect/>
+                          </a:stretch>
+                        </pic:blipFill>
+                        <pic:spPr>
+                          <a:xfrm>
+                            <a:off x="0" y="0"/>
+                            <a:ext cx="93600" cy="93600"/>
+                          </a:xfrm>
+                          <a:prstGeom prst="rect"/>
+                        </pic:spPr>
+                      </pic:pic>
+                    </a:graphicData>
+                  </a:graphic>
+                </wp:inline>
+              </w:drawing>
+            </w:r>
+            <w:r>
+              <w:rPr>
+                <w:rFonts w:ascii="Source Sans 3" w:hAnsi="Source Sans 3" w:eastAsia="Source Sans 3" w:cs="Source Sans 3"/>
+                <w:b w:val="0"/>
+                <w:i w:val="0"/>
+                <w:color w:val="173F4B"/>
+                <w:sz w:val="4"/>
+              </w:rPr>
+              <w:t xml:space="preserve">  </w:t>
+            </w:r>
+            <w:r>
+              <w:rPr>
+                <w:rFonts w:ascii="Source Sans 3" w:hAnsi="Source Sans 3" w:eastAsia="Source Sans 3" w:cs="Source Sans 3"/>
+                <w:b/>
+                <w:i w:val="0"/>
+                <w:color w:val="173F4B"/>
+                <w:sz w:val="15"/>
+                <w:spacing w:val="18"/>
+              </w:rPr>
+              <w:t>INTERESTS</w:t>
+            </w:r>
+          </w:p>
+          <w:p>
+            <w:pPr>
+              <w:keepLines w:val="0"/>
+              <w:spacing w:before="8" w:after="56" w:line="240" w:lineRule="auto"/>
+              <w:ind w:right="737" w:left="680"/>
+              <w:pBdr>
+                <w:bottom w:val="single" w:sz="5" w:space="0" w:color="8FA8B2"/>
+              </w:pBdr>
+            </w:pPr>
+            <w:r>
+              <w:rPr>
+                <w:rFonts w:ascii="Source Sans 3" w:hAnsi="Source Sans 3" w:eastAsia="Source Sans 3" w:cs="Source Sans 3"/>
+                <w:b w:val="0"/>
+                <w:i w:val="0"/>
+                <w:color w:val="173F4B"/>
+                <w:sz w:val="2"/>
+              </w:rPr>
+              <w:t xml:space="preserve"> </w:t>
+            </w:r>
+          </w:p>
+          <w:p>
+            <w:pPr>
+              <w:keepLines/>
+              <w:spacing w:before="0" w:after="0" w:line="240" w:lineRule="auto"/>
+              <w:ind w:left="680" w:right="737"/>
+            </w:pPr>
+            <w:r>
+              <w:rPr>
+                <w:rFonts w:ascii="Source Sans 3" w:hAnsi="Source Sans 3" w:eastAsia="Source Sans 3" w:cs="Source Sans 3"/>
+                <w:b w:val="0"/>
+                <w:i w:val="0"/>
+                <w:color w:val="465E67"/>
+                <w:sz w:val="14"/>
+              </w:rPr>
+              <w:t>Generative AI and technology watch   ·   Algorithmic trading and financial markets   ·   Football   ·   Video games and digital culture</w:t>
+            </w:r>
+          </w:p>
+        </w:tc>
+      </w:tr>
+    </w:tbl>
     <w:sectPr>
-      <w:pgSz w:w="12240" w:h="15840"/>
-      <w:pgMar w:top="720" w:right="864" w:bottom="720" w:left="864" w:header="720" w:footer="720" w:gutter="0"/>
+      <w:pgSz w:w="11906" w:h="16838"/>
+      <w:pgMar w:top="0" w:right="0" w:bottom="0" w:left="0" w:header="0" w:footer="0" w:gutter="0"/>
       <w:cols w:space="720"/>
       <w:docGrid w:linePitch="360"/>
     </w:sectPr>
@@ -1076,9 +3163,13 @@
     <w:name w:val="Normal"/>
     <w:qFormat/>
     <w:rsid w:val="00FC693F"/>
+    <w:pPr>
+      <w:spacing w:before="0" w:after="0" w:line="240" w:lineRule="auto"/>
+    </w:pPr>
     <w:rPr>
-      <w:rFonts w:ascii="Calibri" w:hAnsi="Calibri"/>
-      <w:sz w:val="19"/>
+      <w:rFonts w:ascii="Source Sans 3" w:hAnsi="Source Sans 3"/>
+      <w:color w:val="2A4650"/>
+      <w:sz w:val="16"/>
     </w:rPr>
   </w:style>
   <w:style w:type="paragraph" w:styleId="Header">

</xml_diff>